<commit_message>
Actualizacion de Documentacion tecnica
</commit_message>
<xml_diff>
--- a/documentacion_tecnica.docx
+++ b/documentacion_tecnica.docx
@@ -12,9 +12,9 @@
         <w:rPr>
           <w:b/>
           <w:color w:val="1A2744"/>
-          <w:sz w:val="52"/>
+          <w:sz w:val="56"/>
         </w:rPr>
-        <w:t>AML INTELLIGENCE PLATFORM</w:t>
+        <w:t>SOVEREIGN AML</w:t>
       </w:r>
     </w:p>
     <w:p>
@@ -26,7 +26,7 @@
           <w:color w:val="345E8A"/>
           <w:sz w:val="28"/>
         </w:rPr>
-        <w:t>Documentación Técnica de Ejecución y Uso</w:t>
+        <w:t>Analytical Intelligence Platform — Documentación Técnica</w:t>
       </w:r>
     </w:p>
     <w:p/>
@@ -38,7 +38,7 @@
         <w:rPr>
           <w:sz w:val="20"/>
         </w:rPr>
-        <w:t>Versión 2.5  ·  06 de April de 2026</w:t>
+        <w:t>Versión 3.0  ·  11 de May de 2026</w:t>
       </w:r>
     </w:p>
     <w:p>
@@ -74,7 +74,7 @@
         <w:rPr>
           <w:sz w:val="21"/>
         </w:rPr>
-        <w:t>AML Intelligence Platform es una solución integral de Business Intelligence (BI) y cumplimiento normativo. A diferencia de las herramientas reactivas tradicionales, esta plataforma utiliza análisis de datos avanzado para transformar el monitoreo de riesgos en oportunidades estratégicas de negocio, permitiendo identificar tendencias de mercado y proyecciones de crecimiento mientras se mantiene una postura de seguridad impecable.</w:t>
+        <w:t>SOVEREIGN AML es una solución integral de inteligencia analítica y cumplimiento normativo de última generación. A diferencia de las herramientas reactivas tradicionales, esta plataforma utiliza análisis de datos avanzado y modelos de grafos para transformar el monitoreo de riesgos en oportunidades estratégicas de negocio, integrando estándares internacionales como ISO 31000 y el enfoque basado en riesgo (RBA) del GAFI.</w:t>
       </w:r>
     </w:p>
     <w:p>
@@ -82,7 +82,7 @@
         <w:rPr>
           <w:sz w:val="21"/>
         </w:rPr>
-        <w:t>La plataforma está dirigida a oficiales de cumplimiento, analistas AML y supervisores operativos de instituciones financieras que requieren una herramienta ágil para el procesamiento de datos transaccionales y la generación de reportes de riesgo.</w:t>
+        <w:t>La plataforma está dirigida a oficiales de cumplimiento, analistas AML y supervisores operativos que requieren una herramienta de alta fidelidad para el procesamiento de datos transaccionales complejos y la visualización de redes de lavado de activos.</w:t>
       </w:r>
     </w:p>
     <w:p>
@@ -314,7 +314,7 @@
               <w:rPr>
                 <w:sz w:val="18"/>
               </w:rPr>
-              <w:t>Framework de interfaz web</w:t>
+              <w:t>Framework de interfaz web premium</w:t>
             </w:r>
           </w:p>
         </w:tc>
@@ -376,7 +376,7 @@
               <w:rPr>
                 <w:sz w:val="18"/>
               </w:rPr>
-              <w:t>Procesamiento de datos tabulares</w:t>
+              <w:t>Procesamiento de datos vectoriales</w:t>
             </w:r>
           </w:p>
         </w:tc>
@@ -438,7 +438,7 @@
               <w:rPr>
                 <w:sz w:val="18"/>
               </w:rPr>
-              <w:t>Visualizaciones interactivas con hover</w:t>
+              <w:t>Visualizaciones interactivas de alta densidad</w:t>
             </w:r>
           </w:p>
         </w:tc>
@@ -460,7 +460,7 @@
               <w:rPr>
                 <w:sz w:val="18"/>
               </w:rPr>
-              <w:t>matplotlib</w:t>
+              <w:t>networkx</w:t>
             </w:r>
           </w:p>
         </w:tc>
@@ -480,7 +480,7 @@
               <w:rPr>
                 <w:sz w:val="18"/>
               </w:rPr>
-              <w:t>3.7+</w:t>
+              <w:t>3.0+</w:t>
             </w:r>
           </w:p>
         </w:tc>
@@ -500,7 +500,7 @@
               <w:rPr>
                 <w:sz w:val="18"/>
               </w:rPr>
-              <w:t>Gráficos auxiliares (compatibilidad)</w:t>
+              <w:t>Motor de análisis de grafos y redes</w:t>
             </w:r>
           </w:p>
         </w:tc>
@@ -748,7 +748,7 @@
               <w:rPr>
                 <w:sz w:val="18"/>
               </w:rPr>
-              <w:t>Integración con API de IA (Claude)</w:t>
+              <w:t>Integración con API de Autenticación y IA</w:t>
             </w:r>
           </w:p>
         </w:tc>
@@ -770,7 +770,7 @@
         <w:rPr>
           <w:sz w:val="21"/>
         </w:rPr>
-        <w:t>La plataforma requiere un archivo Excel (.xlsx) con las siguientes columnas obligatorias:</w:t>
+        <w:t>La plataforma requiere un archivo Excel (.xlsx) con la siguiente estructura extendida:</w:t>
       </w:r>
     </w:p>
     <w:tbl>
@@ -878,7 +878,7 @@
               <w:rPr>
                 <w:sz w:val="18"/>
               </w:rPr>
-              <w:t>Cliente</w:t>
+              <w:t>Fecha</w:t>
             </w:r>
           </w:p>
         </w:tc>
@@ -898,7 +898,7 @@
               <w:rPr>
                 <w:sz w:val="18"/>
               </w:rPr>
-              <w:t>Texto / ID</w:t>
+              <w:t>Fecha</w:t>
             </w:r>
           </w:p>
         </w:tc>
@@ -918,7 +918,7 @@
               <w:rPr>
                 <w:sz w:val="18"/>
               </w:rPr>
-              <w:t>Identificador único del cliente</w:t>
+              <w:t>Fecha de la transacción (YYYY-MM-DD)</w:t>
             </w:r>
           </w:p>
         </w:tc>
@@ -940,7 +940,131 @@
               <w:rPr>
                 <w:sz w:val="18"/>
               </w:rPr>
+              <w:t>Cliente</w:t>
+            </w:r>
+          </w:p>
+        </w:tc>
+        <w:tc>
+          <w:tcPr>
+            <w:tcW w:type="dxa" w:w="1701"/>
+            <w:shd w:val="clear" w:color="auto" w:fill="FFFFFF"/>
+            <w:tcBorders>
+              <w:top w:val="single" w:sz="6" w:space="0" w:color="D0D5DD"/>
+              <w:left w:val="single" w:sz="6" w:space="0" w:color="D0D5DD"/>
+              <w:bottom w:val="single" w:sz="6" w:space="0" w:color="D0D5DD"/>
+              <w:right w:val="single" w:sz="6" w:space="0" w:color="D0D5DD"/>
+            </w:tcBorders>
+          </w:tcPr>
+          <w:p>
+            <w:r>
+              <w:rPr>
+                <w:sz w:val="18"/>
+              </w:rPr>
+              <w:t>Texto</w:t>
+            </w:r>
+          </w:p>
+        </w:tc>
+        <w:tc>
+          <w:tcPr>
+            <w:tcW w:type="dxa" w:w="5669"/>
+            <w:shd w:val="clear" w:color="auto" w:fill="FFFFFF"/>
+            <w:tcBorders>
+              <w:top w:val="single" w:sz="6" w:space="0" w:color="D0D5DD"/>
+              <w:left w:val="single" w:sz="6" w:space="0" w:color="D0D5DD"/>
+              <w:bottom w:val="single" w:sz="6" w:space="0" w:color="D0D5DD"/>
+              <w:right w:val="single" w:sz="6" w:space="0" w:color="D0D5DD"/>
+            </w:tcBorders>
+          </w:tcPr>
+          <w:p>
+            <w:r>
+              <w:rPr>
+                <w:sz w:val="18"/>
+              </w:rPr>
+              <w:t>Identificador único del cliente origen</w:t>
+            </w:r>
+          </w:p>
+        </w:tc>
+      </w:tr>
+      <w:tr>
+        <w:tc>
+          <w:tcPr>
+            <w:tcW w:type="dxa" w:w="1984"/>
+            <w:shd w:val="clear" w:color="auto" w:fill="F5F7FA"/>
+            <w:tcBorders>
+              <w:top w:val="single" w:sz="6" w:space="0" w:color="D0D5DD"/>
+              <w:left w:val="single" w:sz="6" w:space="0" w:color="D0D5DD"/>
+              <w:bottom w:val="single" w:sz="6" w:space="0" w:color="D0D5DD"/>
+              <w:right w:val="single" w:sz="6" w:space="0" w:color="D0D5DD"/>
+            </w:tcBorders>
+          </w:tcPr>
+          <w:p>
+            <w:r>
+              <w:rPr>
+                <w:sz w:val="18"/>
+              </w:rPr>
               <w:t>Monto</w:t>
+            </w:r>
+          </w:p>
+        </w:tc>
+        <w:tc>
+          <w:tcPr>
+            <w:tcW w:type="dxa" w:w="1701"/>
+            <w:shd w:val="clear" w:color="auto" w:fill="F5F7FA"/>
+            <w:tcBorders>
+              <w:top w:val="single" w:sz="6" w:space="0" w:color="D0D5DD"/>
+              <w:left w:val="single" w:sz="6" w:space="0" w:color="D0D5DD"/>
+              <w:bottom w:val="single" w:sz="6" w:space="0" w:color="D0D5DD"/>
+              <w:right w:val="single" w:sz="6" w:space="0" w:color="D0D5DD"/>
+            </w:tcBorders>
+          </w:tcPr>
+          <w:p>
+            <w:r>
+              <w:rPr>
+                <w:sz w:val="18"/>
+              </w:rPr>
+              <w:t>Numérico</w:t>
+            </w:r>
+          </w:p>
+        </w:tc>
+        <w:tc>
+          <w:tcPr>
+            <w:tcW w:type="dxa" w:w="5669"/>
+            <w:shd w:val="clear" w:color="auto" w:fill="F5F7FA"/>
+            <w:tcBorders>
+              <w:top w:val="single" w:sz="6" w:space="0" w:color="D0D5DD"/>
+              <w:left w:val="single" w:sz="6" w:space="0" w:color="D0D5DD"/>
+              <w:bottom w:val="single" w:sz="6" w:space="0" w:color="D0D5DD"/>
+              <w:right w:val="single" w:sz="6" w:space="0" w:color="D0D5DD"/>
+            </w:tcBorders>
+          </w:tcPr>
+          <w:p>
+            <w:r>
+              <w:rPr>
+                <w:sz w:val="18"/>
+              </w:rPr>
+              <w:t>Monto de la transacción (Q)</w:t>
+            </w:r>
+          </w:p>
+        </w:tc>
+      </w:tr>
+      <w:tr>
+        <w:tc>
+          <w:tcPr>
+            <w:tcW w:type="dxa" w:w="1984"/>
+            <w:shd w:val="clear" w:color="auto" w:fill="FFFFFF"/>
+            <w:tcBorders>
+              <w:top w:val="single" w:sz="6" w:space="0" w:color="D0D5DD"/>
+              <w:left w:val="single" w:sz="6" w:space="0" w:color="D0D5DD"/>
+              <w:bottom w:val="single" w:sz="6" w:space="0" w:color="D0D5DD"/>
+              <w:right w:val="single" w:sz="6" w:space="0" w:color="D0D5DD"/>
+            </w:tcBorders>
+          </w:tcPr>
+          <w:p>
+            <w:r>
+              <w:rPr>
+                <w:sz w:val="18"/>
+              </w:rPr>
+              <w:t>Perfil</w:t>
             </w:r>
           </w:p>
         </w:tc>
@@ -980,7 +1104,7 @@
               <w:rPr>
                 <w:sz w:val="18"/>
               </w:rPr>
-              <w:t>Monto de la transacción en quetzales (Q)</w:t>
+              <w:t>Límite esperado de actividad (Q)</w:t>
             </w:r>
           </w:p>
         </w:tc>
@@ -1002,7 +1126,7 @@
               <w:rPr>
                 <w:sz w:val="18"/>
               </w:rPr>
-              <w:t>Perfil</w:t>
+              <w:t>EsPEP</w:t>
             </w:r>
           </w:p>
         </w:tc>
@@ -1022,7 +1146,7 @@
               <w:rPr>
                 <w:sz w:val="18"/>
               </w:rPr>
-              <w:t>Numérico</w:t>
+              <w:t>Booleano</w:t>
             </w:r>
           </w:p>
         </w:tc>
@@ -1042,7 +1166,7 @@
               <w:rPr>
                 <w:sz w:val="18"/>
               </w:rPr>
-              <w:t>Límite esperado de actividad del cliente (Q)</w:t>
+              <w:t>Persona Expuesta Políticamente</w:t>
             </w:r>
           </w:p>
         </w:tc>
@@ -1064,7 +1188,7 @@
               <w:rPr>
                 <w:sz w:val="18"/>
               </w:rPr>
-              <w:t>Fecha</w:t>
+              <w:t>EsCPE</w:t>
             </w:r>
           </w:p>
         </w:tc>
@@ -1084,7 +1208,7 @@
               <w:rPr>
                 <w:sz w:val="18"/>
               </w:rPr>
-              <w:t>Fecha</w:t>
+              <w:t>Booleano</w:t>
             </w:r>
           </w:p>
         </w:tc>
@@ -1104,7 +1228,131 @@
               <w:rPr>
                 <w:sz w:val="18"/>
               </w:rPr>
-              <w:t>Fecha de la transacción (formato YYYY-MM-DD o compatible)</w:t>
+              <w:t>Contratista o Proveedor del Estado</w:t>
+            </w:r>
+          </w:p>
+        </w:tc>
+      </w:tr>
+      <w:tr>
+        <w:tc>
+          <w:tcPr>
+            <w:tcW w:type="dxa" w:w="1984"/>
+            <w:shd w:val="clear" w:color="auto" w:fill="F5F7FA"/>
+            <w:tcBorders>
+              <w:top w:val="single" w:sz="6" w:space="0" w:color="D0D5DD"/>
+              <w:left w:val="single" w:sz="6" w:space="0" w:color="D0D5DD"/>
+              <w:bottom w:val="single" w:sz="6" w:space="0" w:color="D0D5DD"/>
+              <w:right w:val="single" w:sz="6" w:space="0" w:color="D0D5DD"/>
+            </w:tcBorders>
+          </w:tcPr>
+          <w:p>
+            <w:r>
+              <w:rPr>
+                <w:sz w:val="18"/>
+              </w:rPr>
+              <w:t>Ubicacion</w:t>
+            </w:r>
+          </w:p>
+        </w:tc>
+        <w:tc>
+          <w:tcPr>
+            <w:tcW w:type="dxa" w:w="1701"/>
+            <w:shd w:val="clear" w:color="auto" w:fill="F5F7FA"/>
+            <w:tcBorders>
+              <w:top w:val="single" w:sz="6" w:space="0" w:color="D0D5DD"/>
+              <w:left w:val="single" w:sz="6" w:space="0" w:color="D0D5DD"/>
+              <w:bottom w:val="single" w:sz="6" w:space="0" w:color="D0D5DD"/>
+              <w:right w:val="single" w:sz="6" w:space="0" w:color="D0D5DD"/>
+            </w:tcBorders>
+          </w:tcPr>
+          <w:p>
+            <w:r>
+              <w:rPr>
+                <w:sz w:val="18"/>
+              </w:rPr>
+              <w:t>Texto</w:t>
+            </w:r>
+          </w:p>
+        </w:tc>
+        <w:tc>
+          <w:tcPr>
+            <w:tcW w:type="dxa" w:w="5669"/>
+            <w:shd w:val="clear" w:color="auto" w:fill="F5F7FA"/>
+            <w:tcBorders>
+              <w:top w:val="single" w:sz="6" w:space="0" w:color="D0D5DD"/>
+              <w:left w:val="single" w:sz="6" w:space="0" w:color="D0D5DD"/>
+              <w:bottom w:val="single" w:sz="6" w:space="0" w:color="D0D5DD"/>
+              <w:right w:val="single" w:sz="6" w:space="0" w:color="D0D5DD"/>
+            </w:tcBorders>
+          </w:tcPr>
+          <w:p>
+            <w:r>
+              <w:rPr>
+                <w:sz w:val="18"/>
+              </w:rPr>
+              <w:t>Departamento o municipio de origen</w:t>
+            </w:r>
+          </w:p>
+        </w:tc>
+      </w:tr>
+      <w:tr>
+        <w:tc>
+          <w:tcPr>
+            <w:tcW w:type="dxa" w:w="1984"/>
+            <w:shd w:val="clear" w:color="auto" w:fill="FFFFFF"/>
+            <w:tcBorders>
+              <w:top w:val="single" w:sz="6" w:space="0" w:color="D0D5DD"/>
+              <w:left w:val="single" w:sz="6" w:space="0" w:color="D0D5DD"/>
+              <w:bottom w:val="single" w:sz="6" w:space="0" w:color="D0D5DD"/>
+              <w:right w:val="single" w:sz="6" w:space="0" w:color="D0D5DD"/>
+            </w:tcBorders>
+          </w:tcPr>
+          <w:p>
+            <w:r>
+              <w:rPr>
+                <w:sz w:val="18"/>
+              </w:rPr>
+              <w:t>Cliente_Destino</w:t>
+            </w:r>
+          </w:p>
+        </w:tc>
+        <w:tc>
+          <w:tcPr>
+            <w:tcW w:type="dxa" w:w="1701"/>
+            <w:shd w:val="clear" w:color="auto" w:fill="FFFFFF"/>
+            <w:tcBorders>
+              <w:top w:val="single" w:sz="6" w:space="0" w:color="D0D5DD"/>
+              <w:left w:val="single" w:sz="6" w:space="0" w:color="D0D5DD"/>
+              <w:bottom w:val="single" w:sz="6" w:space="0" w:color="D0D5DD"/>
+              <w:right w:val="single" w:sz="6" w:space="0" w:color="D0D5DD"/>
+            </w:tcBorders>
+          </w:tcPr>
+          <w:p>
+            <w:r>
+              <w:rPr>
+                <w:sz w:val="18"/>
+              </w:rPr>
+              <w:t>Texto</w:t>
+            </w:r>
+          </w:p>
+        </w:tc>
+        <w:tc>
+          <w:tcPr>
+            <w:tcW w:type="dxa" w:w="5669"/>
+            <w:shd w:val="clear" w:color="auto" w:fill="FFFFFF"/>
+            <w:tcBorders>
+              <w:top w:val="single" w:sz="6" w:space="0" w:color="D0D5DD"/>
+              <w:left w:val="single" w:sz="6" w:space="0" w:color="D0D5DD"/>
+              <w:bottom w:val="single" w:sz="6" w:space="0" w:color="D0D5DD"/>
+              <w:right w:val="single" w:sz="6" w:space="0" w:color="D0D5DD"/>
+            </w:tcBorders>
+          </w:tcPr>
+          <w:p>
+            <w:r>
+              <w:rPr>
+                <w:sz w:val="18"/>
+              </w:rPr>
+              <w:t>Requerido para el análisis de Red Transaccional</w:t>
             </w:r>
           </w:p>
         </w:tc>
@@ -1137,7 +1385,7 @@
         <w:rPr>
           <w:sz w:val="21"/>
         </w:rPr>
-        <w:t>Ejecutar el siguiente comando desde el directorio del proyecto:</w:t>
+        <w:t>Ejecutar el siguiente comando para preparar el entorno:</w:t>
       </w:r>
     </w:p>
     <w:p>
@@ -1147,7 +1395,7 @@
           <w:color w:val="0D6EFD"/>
           <w:sz w:val="19"/>
         </w:rPr>
-        <w:t>pip install streamlit pandas plotly matplotlib numpy openpyxl python-docx requests</w:t>
+        <w:t>pip install streamlit pandas plotly networkx numpy openpyxl python-docx requests</w:t>
       </w:r>
     </w:p>
     <w:p>
@@ -1158,7 +1406,7 @@
         <w:rPr>
           <w:color w:val="1E3A5F"/>
         </w:rPr>
-        <w:t>3.2 Ejecución de la Plataforma</w:t>
+        <w:t>3.2 Ejecución del Ecosistema</w:t>
       </w:r>
     </w:p>
     <w:p>
@@ -1166,7 +1414,33 @@
         <w:rPr>
           <w:sz w:val="21"/>
         </w:rPr>
-        <w:t>Desde el directorio donde se encuentra app2.py, ejecutar:</w:t>
+        <w:t>La plataforma requiere la API de Autenticación activa. En terminales separadas:</w:t>
+      </w:r>
+    </w:p>
+    <w:p>
+      <w:r>
+        <w:rPr>
+          <w:sz w:val="21"/>
+        </w:rPr>
+        <w:t>1. Iniciar Auth API:</w:t>
+      </w:r>
+    </w:p>
+    <w:p>
+      <w:r>
+        <w:rPr>
+          <w:rFonts w:ascii="Courier New" w:hAnsi="Courier New"/>
+          <w:color w:val="0D6EFD"/>
+          <w:sz w:val="19"/>
+        </w:rPr>
+        <w:t>python3 auth_api.py</w:t>
+      </w:r>
+    </w:p>
+    <w:p>
+      <w:r>
+        <w:rPr>
+          <w:sz w:val="21"/>
+        </w:rPr>
+        <w:t>2. Iniciar SOVEREIGN UI:</w:t>
       </w:r>
     </w:p>
     <w:p>
@@ -1180,22 +1454,14 @@
       </w:r>
     </w:p>
     <w:p>
-      <w:r>
-        <w:rPr>
-          <w:sz w:val="21"/>
-        </w:rPr>
-        <w:t>Streamlit abrirá automáticamente el navegador en http://localhost:8501. Si el navegador no se abre, ingresar esa URL manualmente. Para detener el servidor, presionar Ctrl+C en la terminal.</w:t>
-      </w:r>
-    </w:p>
-    <w:p>
       <w:pPr>
-        <w:pStyle w:val="Heading2"/>
+        <w:pStyle w:val="Heading1"/>
       </w:pPr>
       <w:r>
         <w:rPr>
-          <w:color w:val="1E3A5F"/>
+          <w:color w:val="1A2744"/>
         </w:rPr>
-        <w:t>3.3 Generación de la Documentación</w:t>
+        <w:t>4. Arquitectura de Inteligencia (IMPERATOR ENGINE)</w:t>
       </w:r>
     </w:p>
     <w:p>
@@ -1203,44 +1469,7 @@
         <w:rPr>
           <w:sz w:val="21"/>
         </w:rPr>
-        <w:t>Para regenerar este documento, ejecutar:</w:t>
-      </w:r>
-    </w:p>
-    <w:p>
-      <w:r>
-        <w:rPr>
-          <w:rFonts w:ascii="Courier New" w:hAnsi="Courier New"/>
-          <w:color w:val="0D6EFD"/>
-          <w:sz w:val="19"/>
-        </w:rPr>
-        <w:t>python3 generar_docs.py</w:t>
-      </w:r>
-    </w:p>
-    <w:p>
-      <w:r>
-        <w:rPr>
-          <w:sz w:val="21"/>
-        </w:rPr>
-        <w:t>El archivo documentacion_tecnica.docx se generará en el directorio actual de trabajo.</w:t>
-      </w:r>
-    </w:p>
-    <w:p>
-      <w:pPr>
-        <w:pStyle w:val="Heading1"/>
-      </w:pPr>
-      <w:r>
-        <w:rPr>
-          <w:color w:val="1A2744"/>
-        </w:rPr>
-        <w:t>4. Arquitectura Técnica</w:t>
-      </w:r>
-    </w:p>
-    <w:p>
-      <w:r>
-        <w:rPr>
-          <w:sz w:val="21"/>
-        </w:rPr>
-        <w:t>La plataforma sigue una arquitectura de script único (single-file app) con las siguientes capas lógicas:</w:t>
+        <w:t>SOVEREIGN opera bajo el motor IMPERATOR, que segmenta el análisis en 4 dimensiones críticas:</w:t>
       </w:r>
     </w:p>
     <w:tbl>
@@ -1275,7 +1504,7 @@
                 <w:color w:val="FFFFFF"/>
                 <w:sz w:val="19"/>
               </w:rPr>
-              <w:t>Capa</w:t>
+              <w:t>Dimensión</w:t>
             </w:r>
           </w:p>
         </w:tc>
@@ -1322,7 +1551,7 @@
               <w:rPr>
                 <w:sz w:val="18"/>
               </w:rPr>
-              <w:t>Carga de datos</w:t>
+              <w:t>S_T (Transaccional)</w:t>
             </w:r>
           </w:p>
         </w:tc>
@@ -1342,7 +1571,7 @@
               <w:rPr>
                 <w:sz w:val="18"/>
               </w:rPr>
-              <w:t>Lectura del archivo Excel mediante pandas y validación de columnas requeridas.</w:t>
+              <w:t>Detección de patrones mediante reglas de negocio (Smurfing, Picos, Acumulados).</w:t>
             </w:r>
           </w:p>
         </w:tc>
@@ -1364,7 +1593,7 @@
               <w:rPr>
                 <w:sz w:val="18"/>
               </w:rPr>
-              <w:t>Motor de reglas</w:t>
+              <w:t>S_C (Contextual)</w:t>
             </w:r>
           </w:p>
         </w:tc>
@@ -1384,7 +1613,7 @@
               <w:rPr>
                 <w:sz w:val="18"/>
               </w:rPr>
-              <w:t>Aplicación secuencial de 6 reglas AML parametrizables usando operaciones vectoriales de pandas.</w:t>
+              <w:t>Evaluación del perfil del cliente: PEP, CPE y zonas geográficas de riesgo.</w:t>
             </w:r>
           </w:p>
         </w:tc>
@@ -1406,7 +1635,7 @@
               <w:rPr>
                 <w:sz w:val="18"/>
               </w:rPr>
-              <w:t>Scoring</w:t>
+              <w:t>S_B (Conductual)</w:t>
             </w:r>
           </w:p>
         </w:tc>
@@ -1426,7 +1655,7 @@
               <w:rPr>
                 <w:sz w:val="18"/>
               </w:rPr>
-              <w:t>Suma ponderada de reglas activas por transacción, con peso configurable por regla (0–12 pts).</w:t>
+              <w:t>Análisis de desviaciones estadísticas respecto al comportamiento histórico.</w:t>
             </w:r>
           </w:p>
         </w:tc>
@@ -1448,7 +1677,7 @@
               <w:rPr>
                 <w:sz w:val="18"/>
               </w:rPr>
-              <w:t>Clasificación</w:t>
+              <w:t>S_N (Red)</w:t>
             </w:r>
           </w:p>
         </w:tc>
@@ -1468,133 +1697,7 @@
               <w:rPr>
                 <w:sz w:val="18"/>
               </w:rPr>
-              <w:t>Asignación del nivel de riesgo (Crítico / Alto / Medio / Bajo) por cliente basada en Score_Max y Total_Mensual.</w:t>
-            </w:r>
-          </w:p>
-        </w:tc>
-      </w:tr>
-      <w:tr>
-        <w:tc>
-          <w:tcPr>
-            <w:tcW w:type="dxa" w:w="2835"/>
-            <w:shd w:val="clear" w:color="auto" w:fill="F5F7FA"/>
-            <w:tcBorders>
-              <w:top w:val="single" w:sz="6" w:space="0" w:color="D0D5DD"/>
-              <w:left w:val="single" w:sz="6" w:space="0" w:color="D0D5DD"/>
-              <w:bottom w:val="single" w:sz="6" w:space="0" w:color="D0D5DD"/>
-              <w:right w:val="single" w:sz="6" w:space="0" w:color="D0D5DD"/>
-            </w:tcBorders>
-          </w:tcPr>
-          <w:p>
-            <w:r>
-              <w:rPr>
-                <w:sz w:val="18"/>
-              </w:rPr>
-              <w:t>Inteligencia (BI)</w:t>
-            </w:r>
-          </w:p>
-        </w:tc>
-        <w:tc>
-          <w:tcPr>
-            <w:tcW w:type="dxa" w:w="6520"/>
-            <w:shd w:val="clear" w:color="auto" w:fill="F5F7FA"/>
-            <w:tcBorders>
-              <w:top w:val="single" w:sz="6" w:space="0" w:color="D0D5DD"/>
-              <w:left w:val="single" w:sz="6" w:space="0" w:color="D0D5DD"/>
-              <w:bottom w:val="single" w:sz="6" w:space="0" w:color="D0D5DD"/>
-              <w:right w:val="single" w:sz="6" w:space="0" w:color="D0D5DD"/>
-            </w:tcBorders>
-          </w:tcPr>
-          <w:p>
-            <w:r>
-              <w:rPr>
-                <w:sz w:val="18"/>
-              </w:rPr>
-              <w:t>Capa de análisis estratégico que cruza riesgo vs. volumen para identificar canales de alto rendimiento.</w:t>
-            </w:r>
-          </w:p>
-        </w:tc>
-      </w:tr>
-      <w:tr>
-        <w:tc>
-          <w:tcPr>
-            <w:tcW w:type="dxa" w:w="2835"/>
-            <w:shd w:val="clear" w:color="auto" w:fill="FFFFFF"/>
-            <w:tcBorders>
-              <w:top w:val="single" w:sz="6" w:space="0" w:color="D0D5DD"/>
-              <w:left w:val="single" w:sz="6" w:space="0" w:color="D0D5DD"/>
-              <w:bottom w:val="single" w:sz="6" w:space="0" w:color="D0D5DD"/>
-              <w:right w:val="single" w:sz="6" w:space="0" w:color="D0D5DD"/>
-            </w:tcBorders>
-          </w:tcPr>
-          <w:p>
-            <w:r>
-              <w:rPr>
-                <w:sz w:val="18"/>
-              </w:rPr>
-              <w:t>Visualización</w:t>
-            </w:r>
-          </w:p>
-        </w:tc>
-        <w:tc>
-          <w:tcPr>
-            <w:tcW w:type="dxa" w:w="6520"/>
-            <w:shd w:val="clear" w:color="auto" w:fill="FFFFFF"/>
-            <w:tcBorders>
-              <w:top w:val="single" w:sz="6" w:space="0" w:color="D0D5DD"/>
-              <w:left w:val="single" w:sz="6" w:space="0" w:color="D0D5DD"/>
-              <w:bottom w:val="single" w:sz="6" w:space="0" w:color="D0D5DD"/>
-              <w:right w:val="single" w:sz="6" w:space="0" w:color="D0D5DD"/>
-            </w:tcBorders>
-          </w:tcPr>
-          <w:p>
-            <w:r>
-              <w:rPr>
-                <w:sz w:val="18"/>
-              </w:rPr>
-              <w:t>Gráficos interactivos con Plotly (hover, zoom, descarga) y cuadros de interpretación de negocio.</w:t>
-            </w:r>
-          </w:p>
-        </w:tc>
-      </w:tr>
-      <w:tr>
-        <w:tc>
-          <w:tcPr>
-            <w:tcW w:type="dxa" w:w="2835"/>
-            <w:shd w:val="clear" w:color="auto" w:fill="F5F7FA"/>
-            <w:tcBorders>
-              <w:top w:val="single" w:sz="6" w:space="0" w:color="D0D5DD"/>
-              <w:left w:val="single" w:sz="6" w:space="0" w:color="D0D5DD"/>
-              <w:bottom w:val="single" w:sz="6" w:space="0" w:color="D0D5DD"/>
-              <w:right w:val="single" w:sz="6" w:space="0" w:color="D0D5DD"/>
-            </w:tcBorders>
-          </w:tcPr>
-          <w:p>
-            <w:r>
-              <w:rPr>
-                <w:sz w:val="18"/>
-              </w:rPr>
-              <w:t>Integración IA</w:t>
-            </w:r>
-          </w:p>
-        </w:tc>
-        <w:tc>
-          <w:tcPr>
-            <w:tcW w:type="dxa" w:w="6520"/>
-            <w:shd w:val="clear" w:color="auto" w:fill="F5F7FA"/>
-            <w:tcBorders>
-              <w:top w:val="single" w:sz="6" w:space="0" w:color="D0D5DD"/>
-              <w:left w:val="single" w:sz="6" w:space="0" w:color="D0D5DD"/>
-              <w:bottom w:val="single" w:sz="6" w:space="0" w:color="D0D5DD"/>
-              <w:right w:val="single" w:sz="6" w:space="0" w:color="D0D5DD"/>
-            </w:tcBorders>
-          </w:tcPr>
-          <w:p>
-            <w:r>
-              <w:rPr>
-                <w:sz w:val="18"/>
-              </w:rPr>
-              <w:t>Generación de un resumen analítico textual por cliente mediante API de Claude (Anthropic).</w:t>
+              <w:t>Módulo de grafos que identifica cuentas puente, ciclos y estratificación.</w:t>
             </w:r>
           </w:p>
         </w:tc>
@@ -1608,7 +1711,7 @@
         <w:rPr>
           <w:color w:val="1A2744"/>
         </w:rPr>
-        <w:t>5. Motor de Reglas AML</w:t>
+        <w:t>5. Configuración de Detección</w:t>
       </w:r>
     </w:p>
     <w:p>
@@ -1616,7 +1719,7 @@
         <w:rPr>
           <w:sz w:val="21"/>
         </w:rPr>
-        <w:t>El sistema evalúa 6 reglas independientes sobre cada transacción. Los parámetros son completamente configurables desde la vista '⚙️ Configuración de Reglas'. A continuación se describen las reglas con sus valores por defecto:</w:t>
+        <w:t>El motor de detección es dinámico y permite ajustar pesos y umbrales en tiempo real. Los parámetros por defecto del sistema son:</w:t>
       </w:r>
     </w:p>
     <w:tbl>
@@ -1729,7 +1832,7 @@
                 <w:color w:val="FFFFFF"/>
                 <w:sz w:val="19"/>
               </w:rPr>
-              <w:t>Peso default</w:t>
+              <w:t>Peso</w:t>
             </w:r>
           </w:p>
         </w:tc>
@@ -1754,7 +1857,7 @@
                 <w:color w:val="FFFFFF"/>
                 <w:sz w:val="19"/>
               </w:rPr>
-              <w:t>Activa por default</w:t>
+              <w:t>Activa</w:t>
             </w:r>
           </w:p>
         </w:tc>
@@ -1776,7 +1879,7 @@
               <w:rPr>
                 <w:sz w:val="18"/>
               </w:rPr>
-              <w:t>Monto Alto Absoluto</w:t>
+              <w:t>Monto Crítico</w:t>
             </w:r>
           </w:p>
         </w:tc>
@@ -1878,7 +1981,7 @@
               <w:rPr>
                 <w:sz w:val="18"/>
               </w:rPr>
-              <w:t>Acumulado Mensual</w:t>
+              <w:t>Perfil Excedido</w:t>
             </w:r>
           </w:p>
         </w:tc>
@@ -1898,7 +2001,7 @@
               <w:rPr>
                 <w:sz w:val="18"/>
               </w:rPr>
-              <w:t>Alerta_Acumulado</w:t>
+              <w:t>Alerta_15</w:t>
             </w:r>
           </w:p>
         </w:tc>
@@ -1918,211 +2021,7 @@
               <w:rPr>
                 <w:sz w:val="18"/>
               </w:rPr>
-              <w:t>Total_Mensual &gt; Perfil × 2.0</w:t>
-            </w:r>
-          </w:p>
-        </w:tc>
-        <w:tc>
-          <w:tcPr>
-            <w:tcW w:type="dxa" w:w="1134"/>
-            <w:shd w:val="clear" w:color="auto" w:fill="FFFFFF"/>
-            <w:tcBorders>
-              <w:top w:val="single" w:sz="6" w:space="0" w:color="D0D5DD"/>
-              <w:left w:val="single" w:sz="6" w:space="0" w:color="D0D5DD"/>
-              <w:bottom w:val="single" w:sz="6" w:space="0" w:color="D0D5DD"/>
-              <w:right w:val="single" w:sz="6" w:space="0" w:color="D0D5DD"/>
-            </w:tcBorders>
-          </w:tcPr>
-          <w:p>
-            <w:r>
-              <w:rPr>
-                <w:sz w:val="18"/>
-              </w:rPr>
-              <w:t>2</w:t>
-            </w:r>
-          </w:p>
-        </w:tc>
-        <w:tc>
-          <w:tcPr>
-            <w:tcW w:type="dxa" w:w="1417"/>
-            <w:shd w:val="clear" w:color="auto" w:fill="FFFFFF"/>
-            <w:tcBorders>
-              <w:top w:val="single" w:sz="6" w:space="0" w:color="D0D5DD"/>
-              <w:left w:val="single" w:sz="6" w:space="0" w:color="D0D5DD"/>
-              <w:bottom w:val="single" w:sz="6" w:space="0" w:color="D0D5DD"/>
-              <w:right w:val="single" w:sz="6" w:space="0" w:color="D0D5DD"/>
-            </w:tcBorders>
-          </w:tcPr>
-          <w:p>
-            <w:r>
-              <w:rPr>
-                <w:sz w:val="18"/>
-              </w:rPr>
-              <w:t>Sí</w:t>
-            </w:r>
-          </w:p>
-        </w:tc>
-      </w:tr>
-      <w:tr>
-        <w:tc>
-          <w:tcPr>
-            <w:tcW w:type="dxa" w:w="2268"/>
-            <w:shd w:val="clear" w:color="auto" w:fill="F5F7FA"/>
-            <w:tcBorders>
-              <w:top w:val="single" w:sz="6" w:space="0" w:color="D0D5DD"/>
-              <w:left w:val="single" w:sz="6" w:space="0" w:color="D0D5DD"/>
-              <w:bottom w:val="single" w:sz="6" w:space="0" w:color="D0D5DD"/>
-              <w:right w:val="single" w:sz="6" w:space="0" w:color="D0D5DD"/>
-            </w:tcBorders>
-          </w:tcPr>
-          <w:p>
-            <w:r>
-              <w:rPr>
-                <w:sz w:val="18"/>
-              </w:rPr>
-              <w:t>Exceso sobre Perfil</w:t>
-            </w:r>
-          </w:p>
-        </w:tc>
-        <w:tc>
-          <w:tcPr>
-            <w:tcW w:type="dxa" w:w="2268"/>
-            <w:shd w:val="clear" w:color="auto" w:fill="F5F7FA"/>
-            <w:tcBorders>
-              <w:top w:val="single" w:sz="6" w:space="0" w:color="D0D5DD"/>
-              <w:left w:val="single" w:sz="6" w:space="0" w:color="D0D5DD"/>
-              <w:bottom w:val="single" w:sz="6" w:space="0" w:color="D0D5DD"/>
-              <w:right w:val="single" w:sz="6" w:space="0" w:color="D0D5DD"/>
-            </w:tcBorders>
-          </w:tcPr>
-          <w:p>
-            <w:r>
-              <w:rPr>
-                <w:sz w:val="18"/>
-              </w:rPr>
-              <w:t>Alerta_15</w:t>
-            </w:r>
-          </w:p>
-        </w:tc>
-        <w:tc>
-          <w:tcPr>
-            <w:tcW w:type="dxa" w:w="3118"/>
-            <w:shd w:val="clear" w:color="auto" w:fill="F5F7FA"/>
-            <w:tcBorders>
-              <w:top w:val="single" w:sz="6" w:space="0" w:color="D0D5DD"/>
-              <w:left w:val="single" w:sz="6" w:space="0" w:color="D0D5DD"/>
-              <w:bottom w:val="single" w:sz="6" w:space="0" w:color="D0D5DD"/>
-              <w:right w:val="single" w:sz="6" w:space="0" w:color="D0D5DD"/>
-            </w:tcBorders>
-          </w:tcPr>
-          <w:p>
-            <w:r>
-              <w:rPr>
-                <w:sz w:val="18"/>
-              </w:rPr>
               <w:t>Monto &gt; Perfil × 1.15</w:t>
-            </w:r>
-          </w:p>
-        </w:tc>
-        <w:tc>
-          <w:tcPr>
-            <w:tcW w:type="dxa" w:w="1134"/>
-            <w:shd w:val="clear" w:color="auto" w:fill="F5F7FA"/>
-            <w:tcBorders>
-              <w:top w:val="single" w:sz="6" w:space="0" w:color="D0D5DD"/>
-              <w:left w:val="single" w:sz="6" w:space="0" w:color="D0D5DD"/>
-              <w:bottom w:val="single" w:sz="6" w:space="0" w:color="D0D5DD"/>
-              <w:right w:val="single" w:sz="6" w:space="0" w:color="D0D5DD"/>
-            </w:tcBorders>
-          </w:tcPr>
-          <w:p>
-            <w:r>
-              <w:rPr>
-                <w:sz w:val="18"/>
-              </w:rPr>
-              <w:t>1</w:t>
-            </w:r>
-          </w:p>
-        </w:tc>
-        <w:tc>
-          <w:tcPr>
-            <w:tcW w:type="dxa" w:w="1417"/>
-            <w:shd w:val="clear" w:color="auto" w:fill="F5F7FA"/>
-            <w:tcBorders>
-              <w:top w:val="single" w:sz="6" w:space="0" w:color="D0D5DD"/>
-              <w:left w:val="single" w:sz="6" w:space="0" w:color="D0D5DD"/>
-              <w:bottom w:val="single" w:sz="6" w:space="0" w:color="D0D5DD"/>
-              <w:right w:val="single" w:sz="6" w:space="0" w:color="D0D5DD"/>
-            </w:tcBorders>
-          </w:tcPr>
-          <w:p>
-            <w:r>
-              <w:rPr>
-                <w:sz w:val="18"/>
-              </w:rPr>
-              <w:t>Sí</w:t>
-            </w:r>
-          </w:p>
-        </w:tc>
-      </w:tr>
-      <w:tr>
-        <w:tc>
-          <w:tcPr>
-            <w:tcW w:type="dxa" w:w="2268"/>
-            <w:shd w:val="clear" w:color="auto" w:fill="FFFFFF"/>
-            <w:tcBorders>
-              <w:top w:val="single" w:sz="6" w:space="0" w:color="D0D5DD"/>
-              <w:left w:val="single" w:sz="6" w:space="0" w:color="D0D5DD"/>
-              <w:bottom w:val="single" w:sz="6" w:space="0" w:color="D0D5DD"/>
-              <w:right w:val="single" w:sz="6" w:space="0" w:color="D0D5DD"/>
-            </w:tcBorders>
-          </w:tcPr>
-          <w:p>
-            <w:r>
-              <w:rPr>
-                <w:sz w:val="18"/>
-              </w:rPr>
-              <w:t>Frecuencia Alta</w:t>
-            </w:r>
-          </w:p>
-        </w:tc>
-        <w:tc>
-          <w:tcPr>
-            <w:tcW w:type="dxa" w:w="2268"/>
-            <w:shd w:val="clear" w:color="auto" w:fill="FFFFFF"/>
-            <w:tcBorders>
-              <w:top w:val="single" w:sz="6" w:space="0" w:color="D0D5DD"/>
-              <w:left w:val="single" w:sz="6" w:space="0" w:color="D0D5DD"/>
-              <w:bottom w:val="single" w:sz="6" w:space="0" w:color="D0D5DD"/>
-              <w:right w:val="single" w:sz="6" w:space="0" w:color="D0D5DD"/>
-            </w:tcBorders>
-          </w:tcPr>
-          <w:p>
-            <w:r>
-              <w:rPr>
-                <w:sz w:val="18"/>
-              </w:rPr>
-              <w:t>Alerta_Frecuencia</w:t>
-            </w:r>
-          </w:p>
-        </w:tc>
-        <w:tc>
-          <w:tcPr>
-            <w:tcW w:type="dxa" w:w="3118"/>
-            <w:shd w:val="clear" w:color="auto" w:fill="FFFFFF"/>
-            <w:tcBorders>
-              <w:top w:val="single" w:sz="6" w:space="0" w:color="D0D5DD"/>
-              <w:left w:val="single" w:sz="6" w:space="0" w:color="D0D5DD"/>
-              <w:bottom w:val="single" w:sz="6" w:space="0" w:color="D0D5DD"/>
-              <w:right w:val="single" w:sz="6" w:space="0" w:color="D0D5DD"/>
-            </w:tcBorders>
-          </w:tcPr>
-          <w:p>
-            <w:r>
-              <w:rPr>
-                <w:sz w:val="18"/>
-              </w:rPr>
-              <w:t>Transacciones en período &gt; 5</w:t>
             </w:r>
           </w:p>
         </w:tc>
@@ -2224,7 +2123,7 @@
               <w:rPr>
                 <w:sz w:val="18"/>
               </w:rPr>
-              <w:t>Transacciones en mismo día ≥ 5</w:t>
+              <w:t>Transacciones mismo día ≥ 5</w:t>
             </w:r>
           </w:p>
         </w:tc>
@@ -2286,7 +2185,7 @@
               <w:rPr>
                 <w:sz w:val="18"/>
               </w:rPr>
-              <w:t>Pico Anómalo</w:t>
+              <w:t>Geografía Riesgo</w:t>
             </w:r>
           </w:p>
         </w:tc>
@@ -2306,7 +2205,7 @@
               <w:rPr>
                 <w:sz w:val="18"/>
               </w:rPr>
-              <w:t>Pico</w:t>
+              <w:t>Ubicacion</w:t>
             </w:r>
           </w:p>
         </w:tc>
@@ -2326,7 +2225,7 @@
               <w:rPr>
                 <w:sz w:val="18"/>
               </w:rPr>
-              <w:t>Monto &gt; Media + 2×Desv. Estándar</w:t>
+              <w:t>Zonas fronterizas/sensibles</w:t>
             </w:r>
           </w:p>
         </w:tc>
@@ -2371,29 +2270,109 @@
           </w:p>
         </w:tc>
       </w:tr>
+      <w:tr>
+        <w:tc>
+          <w:tcPr>
+            <w:tcW w:type="dxa" w:w="2268"/>
+            <w:shd w:val="clear" w:color="auto" w:fill="F5F7FA"/>
+            <w:tcBorders>
+              <w:top w:val="single" w:sz="6" w:space="0" w:color="D0D5DD"/>
+              <w:left w:val="single" w:sz="6" w:space="0" w:color="D0D5DD"/>
+              <w:bottom w:val="single" w:sz="6" w:space="0" w:color="D0D5DD"/>
+              <w:right w:val="single" w:sz="6" w:space="0" w:color="D0D5DD"/>
+            </w:tcBorders>
+          </w:tcPr>
+          <w:p>
+            <w:r>
+              <w:rPr>
+                <w:sz w:val="18"/>
+              </w:rPr>
+              <w:t>Status Político</w:t>
+            </w:r>
+          </w:p>
+        </w:tc>
+        <w:tc>
+          <w:tcPr>
+            <w:tcW w:type="dxa" w:w="2268"/>
+            <w:shd w:val="clear" w:color="auto" w:fill="F5F7FA"/>
+            <w:tcBorders>
+              <w:top w:val="single" w:sz="6" w:space="0" w:color="D0D5DD"/>
+              <w:left w:val="single" w:sz="6" w:space="0" w:color="D0D5DD"/>
+              <w:bottom w:val="single" w:sz="6" w:space="0" w:color="D0D5DD"/>
+              <w:right w:val="single" w:sz="6" w:space="0" w:color="D0D5DD"/>
+            </w:tcBorders>
+          </w:tcPr>
+          <w:p>
+            <w:r>
+              <w:rPr>
+                <w:sz w:val="18"/>
+              </w:rPr>
+              <w:t>PEP/CPE</w:t>
+            </w:r>
+          </w:p>
+        </w:tc>
+        <w:tc>
+          <w:tcPr>
+            <w:tcW w:type="dxa" w:w="3118"/>
+            <w:shd w:val="clear" w:color="auto" w:fill="F5F7FA"/>
+            <w:tcBorders>
+              <w:top w:val="single" w:sz="6" w:space="0" w:color="D0D5DD"/>
+              <w:left w:val="single" w:sz="6" w:space="0" w:color="D0D5DD"/>
+              <w:bottom w:val="single" w:sz="6" w:space="0" w:color="D0D5DD"/>
+              <w:right w:val="single" w:sz="6" w:space="0" w:color="D0D5DD"/>
+            </w:tcBorders>
+          </w:tcPr>
+          <w:p>
+            <w:r>
+              <w:rPr>
+                <w:sz w:val="18"/>
+              </w:rPr>
+              <w:t>Persona Expuesta / Contratista</w:t>
+            </w:r>
+          </w:p>
+        </w:tc>
+        <w:tc>
+          <w:tcPr>
+            <w:tcW w:type="dxa" w:w="1134"/>
+            <w:shd w:val="clear" w:color="auto" w:fill="F5F7FA"/>
+            <w:tcBorders>
+              <w:top w:val="single" w:sz="6" w:space="0" w:color="D0D5DD"/>
+              <w:left w:val="single" w:sz="6" w:space="0" w:color="D0D5DD"/>
+              <w:bottom w:val="single" w:sz="6" w:space="0" w:color="D0D5DD"/>
+              <w:right w:val="single" w:sz="6" w:space="0" w:color="D0D5DD"/>
+            </w:tcBorders>
+          </w:tcPr>
+          <w:p>
+            <w:r>
+              <w:rPr>
+                <w:sz w:val="18"/>
+              </w:rPr>
+              <w:t>2</w:t>
+            </w:r>
+          </w:p>
+        </w:tc>
+        <w:tc>
+          <w:tcPr>
+            <w:tcW w:type="dxa" w:w="1417"/>
+            <w:shd w:val="clear" w:color="auto" w:fill="F5F7FA"/>
+            <w:tcBorders>
+              <w:top w:val="single" w:sz="6" w:space="0" w:color="D0D5DD"/>
+              <w:left w:val="single" w:sz="6" w:space="0" w:color="D0D5DD"/>
+              <w:bottom w:val="single" w:sz="6" w:space="0" w:color="D0D5DD"/>
+              <w:right w:val="single" w:sz="6" w:space="0" w:color="D0D5DD"/>
+            </w:tcBorders>
+          </w:tcPr>
+          <w:p>
+            <w:r>
+              <w:rPr>
+                <w:sz w:val="18"/>
+              </w:rPr>
+              <w:t>Sí</w:t>
+            </w:r>
+          </w:p>
+        </w:tc>
+      </w:tr>
     </w:tbl>
-    <w:p/>
-    <w:p>
-      <w:r>
-        <w:rPr>
-          <w:sz w:val="21"/>
-        </w:rPr>
-        <w:t>Fórmula de Score por transacción:</w:t>
-      </w:r>
-    </w:p>
-    <w:p>
-      <w:r>
-        <w:rPr>
-          <w:rFonts w:ascii="Courier New" w:hAnsi="Courier New"/>
-          <w:sz w:val="18"/>
-        </w:rPr>
-        <w:t>Score = (Alerta_Absoluto × peso_absoluto) + (Alerta_Acumulado × peso_acumulado)</w:t>
-        <w:br/>
-        <w:t xml:space="preserve">      + (Alerta_15 × peso_perfil)  + (Alerta_Frecuencia × peso_frecuencia)</w:t>
-        <w:br/>
-        <w:t xml:space="preserve">      + (Smurfing × peso_smurfing) + (Pico × peso_pico)</w:t>
-      </w:r>
-    </w:p>
     <w:p>
       <w:pPr>
         <w:pStyle w:val="Heading1"/>
@@ -2402,15 +2381,7 @@
         <w:rPr>
           <w:color w:val="1A2744"/>
         </w:rPr>
-        <w:t>6. Clasificación de Riesgo por Cliente</w:t>
-      </w:r>
-    </w:p>
-    <w:p>
-      <w:r>
-        <w:rPr>
-          <w:sz w:val="21"/>
-        </w:rPr>
-        <w:t>El nivel de riesgo final se asigna según el Score_Max (máximo score alcanzado por cualquier transacción del cliente) y el Total_Mensual:</w:t>
+        <w:t>6. Niveles de Alerta SOVEREIGN</w:t>
       </w:r>
     </w:p>
     <w:tbl>
@@ -2471,7 +2442,7 @@
                 <w:color w:val="FFFFFF"/>
                 <w:sz w:val="19"/>
               </w:rPr>
-              <w:t>Condición (default)</w:t>
+              <w:t>Score Requerido</w:t>
             </w:r>
           </w:p>
         </w:tc>
@@ -2496,7 +2467,7 @@
                 <w:color w:val="FFFFFF"/>
                 <w:sz w:val="19"/>
               </w:rPr>
-              <w:t>Acción recomendada</w:t>
+              <w:t>Acción de Mitigación</w:t>
             </w:r>
           </w:p>
         </w:tc>
@@ -2538,7 +2509,7 @@
               <w:rPr>
                 <w:sz w:val="18"/>
               </w:rPr>
-              <w:t>Score_Max ≥ 8 O Total_Mensual &gt; Q30,000</w:t>
+              <w:t>≥ 8.0</w:t>
             </w:r>
           </w:p>
         </w:tc>
@@ -2558,7 +2529,7 @@
               <w:rPr>
                 <w:sz w:val="18"/>
               </w:rPr>
-              <w:t>Revisión inmediata, posible reporte a UIF</w:t>
+              <w:t>Bloqueo inmediato y Reporte de Operación Sospechosa (ROS)</w:t>
             </w:r>
           </w:p>
         </w:tc>
@@ -2600,7 +2571,7 @@
               <w:rPr>
                 <w:sz w:val="18"/>
               </w:rPr>
-              <w:t>Score_Max ≥ 5</w:t>
+              <w:t>5.0 - 7.9</w:t>
             </w:r>
           </w:p>
         </w:tc>
@@ -2620,7 +2591,7 @@
               <w:rPr>
                 <w:sz w:val="18"/>
               </w:rPr>
-              <w:t>Investigación obligatoria en 5 días hábiles</w:t>
+              <w:t>Debida Diligencia Ampliada (EDD) obligatoria</w:t>
             </w:r>
           </w:p>
         </w:tc>
@@ -2662,7 +2633,7 @@
               <w:rPr>
                 <w:sz w:val="18"/>
               </w:rPr>
-              <w:t>Score_Max ≥ 3</w:t>
+              <w:t>3.0 - 4.9</w:t>
             </w:r>
           </w:p>
         </w:tc>
@@ -2682,7 +2653,7 @@
               <w:rPr>
                 <w:sz w:val="18"/>
               </w:rPr>
-              <w:t>Monitoreo continuo, revisión mensual</w:t>
+              <w:t>Monitoreo reforzado y actualización de perfil</w:t>
             </w:r>
           </w:p>
         </w:tc>
@@ -2724,7 +2695,7 @@
               <w:rPr>
                 <w:sz w:val="18"/>
               </w:rPr>
-              <w:t>Score_Max &lt; 3</w:t>
+              <w:t>&lt; 3.0</w:t>
             </w:r>
           </w:p>
         </w:tc>
@@ -2758,7 +2729,7 @@
         <w:rPr>
           <w:color w:val="1A2744"/>
         </w:rPr>
-        <w:t>7. Vistas del Sistema</w:t>
+        <w:t>7. Módulos de Inteligencia</w:t>
       </w:r>
     </w:p>
     <w:p>
@@ -2777,26 +2748,7 @@
         <w:rPr>
           <w:sz w:val="21"/>
         </w:rPr>
-        <w:t>Vista de alto nivel con KPIs principales y un Panel de Insights Estratégicos. Incluye gráficos de distribución de riesgo, barras de alertas por tipo y la Matriz de Oportunidad de Canal.</w:t>
-      </w:r>
-    </w:p>
-    <w:p>
-      <w:pPr>
-        <w:pStyle w:val="Heading2"/>
-      </w:pPr>
-      <w:r>
-        <w:rPr>
-          <w:color w:val="1E3A5F"/>
-        </w:rPr>
-        <w:t>🎯 Inteligencia Estratégica</w:t>
-      </w:r>
-    </w:p>
-    <w:p>
-      <w:r>
-        <w:rPr>
-          <w:sz w:val="21"/>
-        </w:rPr>
-        <w:t>Módulo que visualiza la Matriz de Oportunidad (Burbujas: Volumen vs Clientes) y la Densidad de Riesgo Agrupada para identificar Canales de Alto Rendimiento.</w:t>
+        <w:t>KPIs centrales, distribución de riesgo y matriz de oportunidad de canal.</w:t>
       </w:r>
     </w:p>
     <w:p>
@@ -2815,7 +2767,7 @@
         <w:rPr>
           <w:sz w:val="21"/>
         </w:rPr>
-        <w:t>Tabla filtrable de todos los clientes con su Score_Max, Total_Mensual, número de transacciones y nivel de riesgo. Soporta filtros por nivel de riesgo (multiselect) y score mínimo (slider).</w:t>
+        <w:t>Centro de gestión de hallazgos con filtrado avanzado por score y tipo.</w:t>
       </w:r>
     </w:p>
     <w:p>
@@ -2826,7 +2778,7 @@
         <w:rPr>
           <w:color w:val="1E3A5F"/>
         </w:rPr>
-        <w:t>📄 Transacciones</w:t>
+        <w:t>🌐 Red Transaccional</w:t>
       </w:r>
     </w:p>
     <w:p>
@@ -2834,7 +2786,64 @@
         <w:rPr>
           <w:sz w:val="21"/>
         </w:rPr>
-        <w:t>Registro detallado de todas las transacciones con sus columnas de alerta booleanas y score individual. Permite filtrar por cliente y mostrar solo transacciones con alertas activas.</w:t>
+        <w:t>Visualización de grafos para detectar estratificación y cuentas puente.</w:t>
+      </w:r>
+    </w:p>
+    <w:p>
+      <w:pPr>
+        <w:pStyle w:val="Heading2"/>
+      </w:pPr>
+      <w:r>
+        <w:rPr>
+          <w:color w:val="1E3A5F"/>
+        </w:rPr>
+        <w:t>🛡️ Acciones de Mitigación</w:t>
+      </w:r>
+    </w:p>
+    <w:p>
+      <w:r>
+        <w:rPr>
+          <w:sz w:val="21"/>
+        </w:rPr>
+        <w:t>Módulo de gestión de riesgos basado en el enfoque RBA del GAFI.</w:t>
+      </w:r>
+    </w:p>
+    <w:p>
+      <w:pPr>
+        <w:pStyle w:val="Heading2"/>
+      </w:pPr>
+      <w:r>
+        <w:rPr>
+          <w:color w:val="1E3A5F"/>
+        </w:rPr>
+        <w:t>📍 Gestión de Ubicaciones</w:t>
+      </w:r>
+    </w:p>
+    <w:p>
+      <w:r>
+        <w:rPr>
+          <w:sz w:val="21"/>
+        </w:rPr>
+        <w:t>Configuración dinámica de zonas de riesgo geográfico.</w:t>
+      </w:r>
+    </w:p>
+    <w:p>
+      <w:pPr>
+        <w:pStyle w:val="Heading2"/>
+      </w:pPr>
+      <w:r>
+        <w:rPr>
+          <w:color w:val="1E3A5F"/>
+        </w:rPr>
+        <w:t>📊 Informes y Reportes</w:t>
+      </w:r>
+    </w:p>
+    <w:p>
+      <w:r>
+        <w:rPr>
+          <w:sz w:val="21"/>
+        </w:rPr>
+        <w:t>Generación de reportes PDF de alta fidelidad para entes reguladores.</w:t>
       </w:r>
     </w:p>
     <w:p>
@@ -2853,7 +2862,7 @@
         <w:rPr>
           <w:sz w:val="21"/>
         </w:rPr>
-        <w:t>Perfil individual del cliente: KPIs, resumen generado por IA (Claude API), gráfico de tendencia de montos vs. perfil, mapa de picos anómalos estadísticos y frecuencia diaria de operaciones.</w:t>
+        <w:t>Perfil 360° con tendencias, mapas de calor y resumen generado por IA.</w:t>
       </w:r>
     </w:p>
     <w:p>
@@ -2864,7 +2873,7 @@
         <w:rPr>
           <w:color w:val="1E3A5F"/>
         </w:rPr>
-        <w:t>🗂️ Matrices de Riesgo</w:t>
+        <w:t>⚙️ Configuración</w:t>
       </w:r>
     </w:p>
     <w:p>
@@ -2872,7 +2881,18 @@
         <w:rPr>
           <w:sz w:val="21"/>
         </w:rPr>
-        <w:t>Matriz de todos los clientes ordenada por score descendente y matriz de tipos de alerta con descripción, peso y cantidad de activaciones. Incluye gráfico de contribución al score por regla.</w:t>
+        <w:t>Control total de umbrales, pesos y parámetros del motor IMPERATOR.</w:t>
+      </w:r>
+    </w:p>
+    <w:p>
+      <w:pPr>
+        <w:pStyle w:val="Heading1"/>
+      </w:pPr>
+      <w:r>
+        <w:rPr>
+          <w:color w:val="1A2744"/>
+        </w:rPr>
+        <w:t>8. Seguridad y Cumplimiento</w:t>
       </w:r>
     </w:p>
     <w:p>
@@ -2883,7 +2903,7 @@
         <w:rPr>
           <w:color w:val="1E3A5F"/>
         </w:rPr>
-        <w:t>⚙️ Configuración de Reglas</w:t>
+        <w:t>Control de Acceso</w:t>
       </w:r>
     </w:p>
     <w:p>
@@ -2891,18 +2911,7 @@
         <w:rPr>
           <w:sz w:val="21"/>
         </w:rPr>
-        <w:t>Panel de control completo con 4 pestañas: Reglas de Detección (umbrales individuales con toggle on/off), Pesos del Score, Clasificación de Riesgo y Resumen con botón de aplicar. Todos los cambios son persistentes en la session_state de Streamlit.</w:t>
-      </w:r>
-    </w:p>
-    <w:p>
-      <w:pPr>
-        <w:pStyle w:val="Heading1"/>
-      </w:pPr>
-      <w:r>
-        <w:rPr>
-          <w:color w:val="1A2744"/>
-        </w:rPr>
-        <w:t>8. Guía de Uso Paso a Paso</w:t>
+        <w:t>Autenticación robusta via Auth API con gestión de licencias corporativas.</w:t>
       </w:r>
     </w:p>
     <w:p>
@@ -2913,7 +2922,7 @@
         <w:rPr>
           <w:color w:val="1E3A5F"/>
         </w:rPr>
-        <w:t>Paso 1 — Preparar el archivo Excel</w:t>
+        <w:t>OWASP Top 10</w:t>
       </w:r>
     </w:p>
     <w:p>
@@ -2921,7 +2930,7 @@
         <w:rPr>
           <w:sz w:val="21"/>
         </w:rPr>
-        <w:t>Verificar que el archivo .xlsx tenga las columnas: Cliente, Monto, Perfil, Fecha. Los nombres son case-sensitive. Las fechas deben estar en formato compatible con pandas.</w:t>
+        <w:t>Diseño orientado a la seguridad: prevención de inyecciones, control de acceso roto y fallos criptográficos.</w:t>
       </w:r>
     </w:p>
     <w:p>
@@ -2932,7 +2941,7 @@
         <w:rPr>
           <w:color w:val="1E3A5F"/>
         </w:rPr>
-        <w:t>Paso 2 — Subir el archivo</w:t>
+        <w:t>IA Generativa</w:t>
       </w:r>
     </w:p>
     <w:p>
@@ -2940,565 +2949,7 @@
         <w:rPr>
           <w:sz w:val="21"/>
         </w:rPr>
-        <w:t>En la sección '📁 Cargar Datos', hacer clic en el área de carga y seleccionar el archivo. El sistema procesará automáticamente todas las reglas AML.</w:t>
-      </w:r>
-    </w:p>
-    <w:p>
-      <w:pPr>
-        <w:pStyle w:val="Heading2"/>
-      </w:pPr>
-      <w:r>
-        <w:rPr>
-          <w:color w:val="1E3A5F"/>
-        </w:rPr>
-        <w:t>Paso 3 — Revisar el Resumen Ejecutivo</w:t>
-      </w:r>
-    </w:p>
-    <w:p>
-      <w:r>
-        <w:rPr>
-          <w:sz w:val="21"/>
-        </w:rPr>
-        <w:t>La primera vista muestra los indicadores clave. Pasar el cursor sobre los gráficos para ver los valores exactos mediante tooltips interactivos.</w:t>
-      </w:r>
-    </w:p>
-    <w:p>
-      <w:pPr>
-        <w:pStyle w:val="Heading2"/>
-      </w:pPr>
-      <w:r>
-        <w:rPr>
-          <w:color w:val="1E3A5F"/>
-        </w:rPr>
-        <w:t>Paso 4 — Analizar Casos Críticos</w:t>
-      </w:r>
-    </w:p>
-    <w:p>
-      <w:r>
-        <w:rPr>
-          <w:sz w:val="21"/>
-        </w:rPr>
-        <w:t>Ir a '🚨 Casos de Alerta', filtrar por nivel 'Crítico' y exportar si es necesario.</w:t>
-      </w:r>
-    </w:p>
-    <w:p>
-      <w:pPr>
-        <w:pStyle w:val="Heading2"/>
-      </w:pPr>
-      <w:r>
-        <w:rPr>
-          <w:color w:val="1E3A5F"/>
-        </w:rPr>
-        <w:t>Paso 5 — Investigar Clientes</w:t>
-      </w:r>
-    </w:p>
-    <w:p>
-      <w:r>
-        <w:rPr>
-          <w:sz w:val="21"/>
-        </w:rPr>
-        <w:t>En '👤 Análisis por Cliente', seleccionar el cliente y usar el botón '🤖 Generar Resumen con IA' (requiere conexión a internet y API key configurada en el código).</w:t>
-      </w:r>
-    </w:p>
-    <w:p>
-      <w:pPr>
-        <w:pStyle w:val="Heading2"/>
-      </w:pPr>
-      <w:r>
-        <w:rPr>
-          <w:color w:val="1E3A5F"/>
-        </w:rPr>
-        <w:t>Paso 6 — Ajustar Parámetros</w:t>
-      </w:r>
-    </w:p>
-    <w:p>
-      <w:r>
-        <w:rPr>
-          <w:sz w:val="21"/>
-        </w:rPr>
-        <w:t>Si los umbrales no se adaptan al perfil de la institución, ir a '⚙️ Configuración de Reglas' y ajustar. Luego volver a cargar el archivo para reprocesar con nuevos parámetros.</w:t>
-      </w:r>
-    </w:p>
-    <w:p>
-      <w:pPr>
-        <w:pStyle w:val="Heading1"/>
-      </w:pPr>
-      <w:r>
-        <w:rPr>
-          <w:color w:val="1A2744"/>
-        </w:rPr>
-        <w:t>9. Glosario Técnico AML</w:t>
-      </w:r>
-    </w:p>
-    <w:tbl>
-      <w:tblPr>
-        <w:tblStyle w:val="TableGrid"/>
-        <w:tblW w:type="auto" w:w="0"/>
-        <w:tblLook w:firstColumn="1" w:firstRow="1" w:lastColumn="0" w:lastRow="0" w:noHBand="0" w:noVBand="1" w:val="04A0"/>
-      </w:tblPr>
-      <w:tblGrid>
-        <w:gridCol w:w="4561"/>
-        <w:gridCol w:w="4561"/>
-      </w:tblGrid>
-      <w:tr>
-        <w:tc>
-          <w:tcPr>
-            <w:tcW w:type="dxa" w:w="3118"/>
-            <w:shd w:val="clear" w:color="auto" w:fill="1A2744"/>
-            <w:tcBorders>
-              <w:top w:val="single" w:sz="6" w:space="0" w:color="1A2744"/>
-              <w:left w:val="single" w:sz="6" w:space="0" w:color="1A2744"/>
-              <w:bottom w:val="single" w:sz="6" w:space="0" w:color="1A2744"/>
-              <w:right w:val="single" w:sz="6" w:space="0" w:color="1A2744"/>
-            </w:tcBorders>
-          </w:tcPr>
-          <w:p>
-            <w:pPr>
-              <w:jc w:val="center"/>
-            </w:pPr>
-            <w:r>
-              <w:rPr>
-                <w:b/>
-                <w:color w:val="FFFFFF"/>
-                <w:sz w:val="19"/>
-              </w:rPr>
-              <w:t>Término</w:t>
-            </w:r>
-          </w:p>
-        </w:tc>
-        <w:tc>
-          <w:tcPr>
-            <w:tcW w:type="dxa" w:w="6236"/>
-            <w:shd w:val="clear" w:color="auto" w:fill="1A2744"/>
-            <w:tcBorders>
-              <w:top w:val="single" w:sz="6" w:space="0" w:color="1A2744"/>
-              <w:left w:val="single" w:sz="6" w:space="0" w:color="1A2744"/>
-              <w:bottom w:val="single" w:sz="6" w:space="0" w:color="1A2744"/>
-              <w:right w:val="single" w:sz="6" w:space="0" w:color="1A2744"/>
-            </w:tcBorders>
-          </w:tcPr>
-          <w:p>
-            <w:pPr>
-              <w:jc w:val="center"/>
-            </w:pPr>
-            <w:r>
-              <w:rPr>
-                <w:b/>
-                <w:color w:val="FFFFFF"/>
-                <w:sz w:val="19"/>
-              </w:rPr>
-              <w:t>Definición</w:t>
-            </w:r>
-          </w:p>
-        </w:tc>
-      </w:tr>
-      <w:tr>
-        <w:tc>
-          <w:tcPr>
-            <w:tcW w:type="dxa" w:w="3118"/>
-            <w:shd w:val="clear" w:color="auto" w:fill="F5F7FA"/>
-            <w:tcBorders>
-              <w:top w:val="single" w:sz="6" w:space="0" w:color="D0D5DD"/>
-              <w:left w:val="single" w:sz="6" w:space="0" w:color="D0D5DD"/>
-              <w:bottom w:val="single" w:sz="6" w:space="0" w:color="D0D5DD"/>
-              <w:right w:val="single" w:sz="6" w:space="0" w:color="D0D5DD"/>
-            </w:tcBorders>
-          </w:tcPr>
-          <w:p>
-            <w:r>
-              <w:rPr>
-                <w:sz w:val="18"/>
-              </w:rPr>
-              <w:t>AML (Anti-Money Laundering)</w:t>
-            </w:r>
-          </w:p>
-        </w:tc>
-        <w:tc>
-          <w:tcPr>
-            <w:tcW w:type="dxa" w:w="6236"/>
-            <w:shd w:val="clear" w:color="auto" w:fill="F5F7FA"/>
-            <w:tcBorders>
-              <w:top w:val="single" w:sz="6" w:space="0" w:color="D0D5DD"/>
-              <w:left w:val="single" w:sz="6" w:space="0" w:color="D0D5DD"/>
-              <w:bottom w:val="single" w:sz="6" w:space="0" w:color="D0D5DD"/>
-              <w:right w:val="single" w:sz="6" w:space="0" w:color="D0D5DD"/>
-            </w:tcBorders>
-          </w:tcPr>
-          <w:p>
-            <w:r>
-              <w:rPr>
-                <w:sz w:val="18"/>
-              </w:rPr>
-              <w:t>Conjunto de leyes, regulaciones y procedimientos para prevenir el lavado de activos.</w:t>
-            </w:r>
-          </w:p>
-        </w:tc>
-      </w:tr>
-      <w:tr>
-        <w:tc>
-          <w:tcPr>
-            <w:tcW w:type="dxa" w:w="3118"/>
-            <w:shd w:val="clear" w:color="auto" w:fill="FFFFFF"/>
-            <w:tcBorders>
-              <w:top w:val="single" w:sz="6" w:space="0" w:color="D0D5DD"/>
-              <w:left w:val="single" w:sz="6" w:space="0" w:color="D0D5DD"/>
-              <w:bottom w:val="single" w:sz="6" w:space="0" w:color="D0D5DD"/>
-              <w:right w:val="single" w:sz="6" w:space="0" w:color="D0D5DD"/>
-            </w:tcBorders>
-          </w:tcPr>
-          <w:p>
-            <w:r>
-              <w:rPr>
-                <w:sz w:val="18"/>
-              </w:rPr>
-              <w:t>Score de Riesgo</w:t>
-            </w:r>
-          </w:p>
-        </w:tc>
-        <w:tc>
-          <w:tcPr>
-            <w:tcW w:type="dxa" w:w="6236"/>
-            <w:shd w:val="clear" w:color="auto" w:fill="FFFFFF"/>
-            <w:tcBorders>
-              <w:top w:val="single" w:sz="6" w:space="0" w:color="D0D5DD"/>
-              <w:left w:val="single" w:sz="6" w:space="0" w:color="D0D5DD"/>
-              <w:bottom w:val="single" w:sz="6" w:space="0" w:color="D0D5DD"/>
-              <w:right w:val="single" w:sz="6" w:space="0" w:color="D0D5DD"/>
-            </w:tcBorders>
-          </w:tcPr>
-          <w:p>
-            <w:r>
-              <w:rPr>
-                <w:sz w:val="18"/>
-              </w:rPr>
-              <w:t>Puntuación compuesta (0–12) que refleja el nivel de actividad sospechosa de un cliente.</w:t>
-            </w:r>
-          </w:p>
-        </w:tc>
-      </w:tr>
-      <w:tr>
-        <w:tc>
-          <w:tcPr>
-            <w:tcW w:type="dxa" w:w="3118"/>
-            <w:shd w:val="clear" w:color="auto" w:fill="F5F7FA"/>
-            <w:tcBorders>
-              <w:top w:val="single" w:sz="6" w:space="0" w:color="D0D5DD"/>
-              <w:left w:val="single" w:sz="6" w:space="0" w:color="D0D5DD"/>
-              <w:bottom w:val="single" w:sz="6" w:space="0" w:color="D0D5DD"/>
-              <w:right w:val="single" w:sz="6" w:space="0" w:color="D0D5DD"/>
-            </w:tcBorders>
-          </w:tcPr>
-          <w:p>
-            <w:r>
-              <w:rPr>
-                <w:sz w:val="18"/>
-              </w:rPr>
-              <w:t>Smurfing</w:t>
-            </w:r>
-          </w:p>
-        </w:tc>
-        <w:tc>
-          <w:tcPr>
-            <w:tcW w:type="dxa" w:w="6236"/>
-            <w:shd w:val="clear" w:color="auto" w:fill="F5F7FA"/>
-            <w:tcBorders>
-              <w:top w:val="single" w:sz="6" w:space="0" w:color="D0D5DD"/>
-              <w:left w:val="single" w:sz="6" w:space="0" w:color="D0D5DD"/>
-              <w:bottom w:val="single" w:sz="6" w:space="0" w:color="D0D5DD"/>
-              <w:right w:val="single" w:sz="6" w:space="0" w:color="D0D5DD"/>
-            </w:tcBorders>
-          </w:tcPr>
-          <w:p>
-            <w:r>
-              <w:rPr>
-                <w:sz w:val="18"/>
-              </w:rPr>
-              <w:t>Técnica de fragmentar grandes sumas en múltiples transacciones pequeñas para evadir controles.</w:t>
-            </w:r>
-          </w:p>
-        </w:tc>
-      </w:tr>
-      <w:tr>
-        <w:tc>
-          <w:tcPr>
-            <w:tcW w:type="dxa" w:w="3118"/>
-            <w:shd w:val="clear" w:color="auto" w:fill="FFFFFF"/>
-            <w:tcBorders>
-              <w:top w:val="single" w:sz="6" w:space="0" w:color="D0D5DD"/>
-              <w:left w:val="single" w:sz="6" w:space="0" w:color="D0D5DD"/>
-              <w:bottom w:val="single" w:sz="6" w:space="0" w:color="D0D5DD"/>
-              <w:right w:val="single" w:sz="6" w:space="0" w:color="D0D5DD"/>
-            </w:tcBorders>
-          </w:tcPr>
-          <w:p>
-            <w:r>
-              <w:rPr>
-                <w:sz w:val="18"/>
-              </w:rPr>
-              <w:t>Pico Anómalo</w:t>
-            </w:r>
-          </w:p>
-        </w:tc>
-        <w:tc>
-          <w:tcPr>
-            <w:tcW w:type="dxa" w:w="6236"/>
-            <w:shd w:val="clear" w:color="auto" w:fill="FFFFFF"/>
-            <w:tcBorders>
-              <w:top w:val="single" w:sz="6" w:space="0" w:color="D0D5DD"/>
-              <w:left w:val="single" w:sz="6" w:space="0" w:color="D0D5DD"/>
-              <w:bottom w:val="single" w:sz="6" w:space="0" w:color="D0D5DD"/>
-              <w:right w:val="single" w:sz="6" w:space="0" w:color="D0D5DD"/>
-            </w:tcBorders>
-          </w:tcPr>
-          <w:p>
-            <w:r>
-              <w:rPr>
-                <w:sz w:val="18"/>
-              </w:rPr>
-              <w:t>Transacción cuyo monto supera la media histórica del cliente más 2 desviaciones estándar.</w:t>
-            </w:r>
-          </w:p>
-        </w:tc>
-      </w:tr>
-      <w:tr>
-        <w:tc>
-          <w:tcPr>
-            <w:tcW w:type="dxa" w:w="3118"/>
-            <w:shd w:val="clear" w:color="auto" w:fill="F5F7FA"/>
-            <w:tcBorders>
-              <w:top w:val="single" w:sz="6" w:space="0" w:color="D0D5DD"/>
-              <w:left w:val="single" w:sz="6" w:space="0" w:color="D0D5DD"/>
-              <w:bottom w:val="single" w:sz="6" w:space="0" w:color="D0D5DD"/>
-              <w:right w:val="single" w:sz="6" w:space="0" w:color="D0D5DD"/>
-            </w:tcBorders>
-          </w:tcPr>
-          <w:p>
-            <w:r>
-              <w:rPr>
-                <w:sz w:val="18"/>
-              </w:rPr>
-              <w:t>Perfil de Riesgo</w:t>
-            </w:r>
-          </w:p>
-        </w:tc>
-        <w:tc>
-          <w:tcPr>
-            <w:tcW w:type="dxa" w:w="6236"/>
-            <w:shd w:val="clear" w:color="auto" w:fill="F5F7FA"/>
-            <w:tcBorders>
-              <w:top w:val="single" w:sz="6" w:space="0" w:color="D0D5DD"/>
-              <w:left w:val="single" w:sz="6" w:space="0" w:color="D0D5DD"/>
-              <w:bottom w:val="single" w:sz="6" w:space="0" w:color="D0D5DD"/>
-              <w:right w:val="single" w:sz="6" w:space="0" w:color="D0D5DD"/>
-            </w:tcBorders>
-          </w:tcPr>
-          <w:p>
-            <w:r>
-              <w:rPr>
-                <w:sz w:val="18"/>
-              </w:rPr>
-              <w:t>Nivel de actividad transaccional esperado para un cliente según su tipo de negocio.</w:t>
-            </w:r>
-          </w:p>
-        </w:tc>
-      </w:tr>
-      <w:tr>
-        <w:tc>
-          <w:tcPr>
-            <w:tcW w:type="dxa" w:w="3118"/>
-            <w:shd w:val="clear" w:color="auto" w:fill="FFFFFF"/>
-            <w:tcBorders>
-              <w:top w:val="single" w:sz="6" w:space="0" w:color="D0D5DD"/>
-              <w:left w:val="single" w:sz="6" w:space="0" w:color="D0D5DD"/>
-              <w:bottom w:val="single" w:sz="6" w:space="0" w:color="D0D5DD"/>
-              <w:right w:val="single" w:sz="6" w:space="0" w:color="D0D5DD"/>
-            </w:tcBorders>
-          </w:tcPr>
-          <w:p>
-            <w:r>
-              <w:rPr>
-                <w:sz w:val="18"/>
-              </w:rPr>
-              <w:t>Score_Max</w:t>
-            </w:r>
-          </w:p>
-        </w:tc>
-        <w:tc>
-          <w:tcPr>
-            <w:tcW w:type="dxa" w:w="6236"/>
-            <w:shd w:val="clear" w:color="auto" w:fill="FFFFFF"/>
-            <w:tcBorders>
-              <w:top w:val="single" w:sz="6" w:space="0" w:color="D0D5DD"/>
-              <w:left w:val="single" w:sz="6" w:space="0" w:color="D0D5DD"/>
-              <w:bottom w:val="single" w:sz="6" w:space="0" w:color="D0D5DD"/>
-              <w:right w:val="single" w:sz="6" w:space="0" w:color="D0D5DD"/>
-            </w:tcBorders>
-          </w:tcPr>
-          <w:p>
-            <w:r>
-              <w:rPr>
-                <w:sz w:val="18"/>
-              </w:rPr>
-              <w:t>Máximo score obtenido por cualquier transacción individual de un cliente en el período.</w:t>
-            </w:r>
-          </w:p>
-        </w:tc>
-      </w:tr>
-      <w:tr>
-        <w:tc>
-          <w:tcPr>
-            <w:tcW w:type="dxa" w:w="3118"/>
-            <w:shd w:val="clear" w:color="auto" w:fill="F5F7FA"/>
-            <w:tcBorders>
-              <w:top w:val="single" w:sz="6" w:space="0" w:color="D0D5DD"/>
-              <w:left w:val="single" w:sz="6" w:space="0" w:color="D0D5DD"/>
-              <w:bottom w:val="single" w:sz="6" w:space="0" w:color="D0D5DD"/>
-              <w:right w:val="single" w:sz="6" w:space="0" w:color="D0D5DD"/>
-            </w:tcBorders>
-          </w:tcPr>
-          <w:p>
-            <w:r>
-              <w:rPr>
-                <w:sz w:val="18"/>
-              </w:rPr>
-              <w:t>UIF</w:t>
-            </w:r>
-          </w:p>
-        </w:tc>
-        <w:tc>
-          <w:tcPr>
-            <w:tcW w:type="dxa" w:w="6236"/>
-            <w:shd w:val="clear" w:color="auto" w:fill="F5F7FA"/>
-            <w:tcBorders>
-              <w:top w:val="single" w:sz="6" w:space="0" w:color="D0D5DD"/>
-              <w:left w:val="single" w:sz="6" w:space="0" w:color="D0D5DD"/>
-              <w:bottom w:val="single" w:sz="6" w:space="0" w:color="D0D5DD"/>
-              <w:right w:val="single" w:sz="6" w:space="0" w:color="D0D5DD"/>
-            </w:tcBorders>
-          </w:tcPr>
-          <w:p>
-            <w:r>
-              <w:rPr>
-                <w:sz w:val="18"/>
-              </w:rPr>
-              <w:t>Unidad de Información Financiera — entidad receptora de reportes de operaciones sospechosas.</w:t>
-            </w:r>
-          </w:p>
-        </w:tc>
-      </w:tr>
-      <w:tr>
-        <w:tc>
-          <w:tcPr>
-            <w:tcW w:type="dxa" w:w="3118"/>
-            <w:shd w:val="clear" w:color="auto" w:fill="FFFFFF"/>
-            <w:tcBorders>
-              <w:top w:val="single" w:sz="6" w:space="0" w:color="D0D5DD"/>
-              <w:left w:val="single" w:sz="6" w:space="0" w:color="D0D5DD"/>
-              <w:bottom w:val="single" w:sz="6" w:space="0" w:color="D0D5DD"/>
-              <w:right w:val="single" w:sz="6" w:space="0" w:color="D0D5DD"/>
-            </w:tcBorders>
-          </w:tcPr>
-          <w:p>
-            <w:r>
-              <w:rPr>
-                <w:sz w:val="18"/>
-              </w:rPr>
-              <w:t>Session State</w:t>
-            </w:r>
-          </w:p>
-        </w:tc>
-        <w:tc>
-          <w:tcPr>
-            <w:tcW w:type="dxa" w:w="6236"/>
-            <w:shd w:val="clear" w:color="auto" w:fill="FFFFFF"/>
-            <w:tcBorders>
-              <w:top w:val="single" w:sz="6" w:space="0" w:color="D0D5DD"/>
-              <w:left w:val="single" w:sz="6" w:space="0" w:color="D0D5DD"/>
-              <w:bottom w:val="single" w:sz="6" w:space="0" w:color="D0D5DD"/>
-              <w:right w:val="single" w:sz="6" w:space="0" w:color="D0D5DD"/>
-            </w:tcBorders>
-          </w:tcPr>
-          <w:p>
-            <w:r>
-              <w:rPr>
-                <w:sz w:val="18"/>
-              </w:rPr>
-              <w:t>Mecanismo de Streamlit para mantener variables persistentes entre reruns de la aplicación.</w:t>
-            </w:r>
-          </w:p>
-        </w:tc>
-      </w:tr>
-      <w:tr>
-        <w:tc>
-          <w:tcPr>
-            <w:tcW w:type="dxa" w:w="3118"/>
-            <w:shd w:val="clear" w:color="auto" w:fill="F5F7FA"/>
-            <w:tcBorders>
-              <w:top w:val="single" w:sz="6" w:space="0" w:color="D0D5DD"/>
-              <w:left w:val="single" w:sz="6" w:space="0" w:color="D0D5DD"/>
-              <w:bottom w:val="single" w:sz="6" w:space="0" w:color="D0D5DD"/>
-              <w:right w:val="single" w:sz="6" w:space="0" w:color="D0D5DD"/>
-            </w:tcBorders>
-          </w:tcPr>
-          <w:p>
-            <w:r>
-              <w:rPr>
-                <w:sz w:val="18"/>
-              </w:rPr>
-              <w:t>Hover Tooltip</w:t>
-            </w:r>
-          </w:p>
-        </w:tc>
-        <w:tc>
-          <w:tcPr>
-            <w:tcW w:type="dxa" w:w="6236"/>
-            <w:shd w:val="clear" w:color="auto" w:fill="F5F7FA"/>
-            <w:tcBorders>
-              <w:top w:val="single" w:sz="6" w:space="0" w:color="D0D5DD"/>
-              <w:left w:val="single" w:sz="6" w:space="0" w:color="D0D5DD"/>
-              <w:bottom w:val="single" w:sz="6" w:space="0" w:color="D0D5DD"/>
-              <w:right w:val="single" w:sz="6" w:space="0" w:color="D0D5DD"/>
-            </w:tcBorders>
-          </w:tcPr>
-          <w:p>
-            <w:r>
-              <w:rPr>
-                <w:sz w:val="18"/>
-              </w:rPr>
-              <w:t>Información emergente que aparece al posicionar el cursor sobre un punto del gráfico Plotly.</w:t>
-            </w:r>
-          </w:p>
-        </w:tc>
-      </w:tr>
-    </w:tbl>
-    <w:p>
-      <w:pPr>
-        <w:pStyle w:val="Heading1"/>
-      </w:pPr>
-      <w:r>
-        <w:rPr>
-          <w:color w:val="1A2744"/>
-        </w:rPr>
-        <w:t>10. Notas Técnicas Adicionales</w:t>
-      </w:r>
-    </w:p>
-    <w:p>
-      <w:pPr>
-        <w:pStyle w:val="Heading2"/>
-      </w:pPr>
-      <w:r>
-        <w:rPr>
-          <w:color w:val="1E3A5F"/>
-        </w:rPr>
-        <w:t>Gráficos interactivos</w:t>
-      </w:r>
-    </w:p>
-    <w:p>
-      <w:r>
-        <w:rPr>
-          <w:sz w:val="21"/>
-        </w:rPr>
-        <w:t>Todos los gráficos utilizan Plotly. Cada punto, barra o segmento muestra un tooltip al posicionar el cursor. Los gráficos soportan zoom (arrastrar), paneo (shift+arrastrar) y descarga como PNG mediante el botón de cámara en la esquina superior derecha.</w:t>
+        <w:t>Resúmenes analíticos automatizados mediante integración con modelos de lenguaje avanzados.</w:t>
       </w:r>
     </w:p>
     <w:p>
@@ -3517,45 +2968,7 @@
         <w:rPr>
           <w:sz w:val="21"/>
         </w:rPr>
-        <w:t>La plataforma es completamente portable. Solo requiere Python 3.9+ y las dependencias listadas en la Sección 2. No requiere instalación de base de datos ni servicios externos (excepto la integración opcional con la API de IA).</w:t>
-      </w:r>
-    </w:p>
-    <w:p>
-      <w:pPr>
-        <w:pStyle w:val="Heading2"/>
-      </w:pPr>
-      <w:r>
-        <w:rPr>
-          <w:color w:val="1E3A5F"/>
-        </w:rPr>
-        <w:t>Integración con IA</w:t>
-      </w:r>
-    </w:p>
-    <w:p>
-      <w:r>
-        <w:rPr>
-          <w:sz w:val="21"/>
-        </w:rPr>
-        <w:t>El módulo de resumen IA usa la API de Anthropic (Claude). Requiere que la API key esté configurada directamente en el código. Si no hay conexión o key válida, el resto de la plataforma funciona con normalidad.</w:t>
-      </w:r>
-    </w:p>
-    <w:p>
-      <w:pPr>
-        <w:pStyle w:val="Heading2"/>
-      </w:pPr>
-      <w:r>
-        <w:rPr>
-          <w:color w:val="1E3A5F"/>
-        </w:rPr>
-        <w:t>Persistencia de datos</w:t>
-      </w:r>
-    </w:p>
-    <w:p>
-      <w:r>
-        <w:rPr>
-          <w:sz w:val="21"/>
-        </w:rPr>
-        <w:t>La plataforma no almacena datos entre sesiones. Cada vez que se sube un nuevo archivo, se reprocesa todo desde cero. Los cambios de configuración se mantienen durante la sesión activa mediante session_state.</w:t>
+        <w:t>Estructura modular compatible con entornos locales y despliegues en la nube.</w:t>
       </w:r>
     </w:p>
     <w:p/>
@@ -3568,7 +2981,7 @@
           <w:color w:val="888888"/>
           <w:sz w:val="18"/>
         </w:rPr>
-        <w:t>AML Intelligence Platform v2.0  ·  Generado el 06/04/2026</w:t>
+        <w:t>SOVEREIGN AML Intelligence Platform v3.0  ·  Generado el 11/05/2026</w:t>
       </w:r>
     </w:p>
     <w:sectPr>

</xml_diff>

<commit_message>
feat: integración de módulo IMPERATOR, persistencia de sesiones y UI refinada
- Se creó el módulo IMPERATOR Diagnostics para gobernanza analítica avanzada, dominancia de reglas y stress testing.
- Implementado sistema nativo de persistencia de sesiones (.saml) que permite exportar y reanudar análisis completos (configuraciones + datos) sin requerir el Excel original.
- Agregada nueva alerta regulatoria dinámica (Regla 7) para transiciones FEIS a FEIC basada en umbral configurable desde interfaz.
- UI: Integración de mensaje de bienvenida dinámico extrayendo el nombre del usuario logueado en la pantalla de carga.
- Fix UI: Reemplazo del logo de login remoto por carga segura y local en base64 (Logo AML.png).
- Limpieza de UI: Eliminación de emojis decorativos en todos los módulos para reforzar la estética Dark Fintech profesional.
</commit_message>
<xml_diff>
--- a/documentacion_tecnica.docx
+++ b/documentacion_tecnica.docx
@@ -38,7 +38,7 @@
         <w:rPr>
           <w:sz w:val="20"/>
         </w:rPr>
-        <w:t>Versión 3.0  ·  11 de May de 2026</w:t>
+        <w:t>Versión 3.1  ·  13 de May de 2026</w:t>
       </w:r>
     </w:p>
     <w:p>
@@ -294,7 +294,7 @@
               <w:rPr>
                 <w:sz w:val="18"/>
               </w:rPr>
-              <w:t>1.30+</w:t>
+              <w:t>1.55+</w:t>
             </w:r>
           </w:p>
         </w:tc>
@@ -356,7 +356,7 @@
               <w:rPr>
                 <w:sz w:val="18"/>
               </w:rPr>
-              <w:t>2.0+</w:t>
+              <w:t>2.3+</w:t>
             </w:r>
           </w:p>
         </w:tc>
@@ -418,7 +418,7 @@
               <w:rPr>
                 <w:sz w:val="18"/>
               </w:rPr>
-              <w:t>5.0+</w:t>
+              <w:t>6.6+</w:t>
             </w:r>
           </w:p>
         </w:tc>
@@ -480,7 +480,7 @@
               <w:rPr>
                 <w:sz w:val="18"/>
               </w:rPr>
-              <w:t>3.0+</w:t>
+              <w:t>3.6+</w:t>
             </w:r>
           </w:p>
         </w:tc>
@@ -542,7 +542,7 @@
               <w:rPr>
                 <w:sz w:val="18"/>
               </w:rPr>
-              <w:t>1.24+</w:t>
+              <w:t>2.4+</w:t>
             </w:r>
           </w:p>
         </w:tc>
@@ -728,7 +728,7 @@
               <w:rPr>
                 <w:sz w:val="18"/>
               </w:rPr>
-              <w:t>2.28+</w:t>
+              <w:t>2.33+</w:t>
             </w:r>
           </w:p>
         </w:tc>
@@ -748,7 +748,255 @@
               <w:rPr>
                 <w:sz w:val="18"/>
               </w:rPr>
-              <w:t>Integración con API de Autenticación y IA</w:t>
+              <w:t>Integración con API de Autenticación y servicios internos</w:t>
+            </w:r>
+          </w:p>
+        </w:tc>
+      </w:tr>
+      <w:tr>
+        <w:tc>
+          <w:tcPr>
+            <w:tcW w:type="dxa" w:w="2268"/>
+            <w:shd w:val="clear" w:color="auto" w:fill="FFFFFF"/>
+            <w:tcBorders>
+              <w:top w:val="single" w:sz="6" w:space="0" w:color="D0D5DD"/>
+              <w:left w:val="single" w:sz="6" w:space="0" w:color="D0D5DD"/>
+              <w:bottom w:val="single" w:sz="6" w:space="0" w:color="D0D5DD"/>
+              <w:right w:val="single" w:sz="6" w:space="0" w:color="D0D5DD"/>
+            </w:tcBorders>
+          </w:tcPr>
+          <w:p>
+            <w:r>
+              <w:rPr>
+                <w:sz w:val="18"/>
+              </w:rPr>
+              <w:t>GitPython</w:t>
+            </w:r>
+          </w:p>
+        </w:tc>
+        <w:tc>
+          <w:tcPr>
+            <w:tcW w:type="dxa" w:w="1984"/>
+            <w:shd w:val="clear" w:color="auto" w:fill="FFFFFF"/>
+            <w:tcBorders>
+              <w:top w:val="single" w:sz="6" w:space="0" w:color="D0D5DD"/>
+              <w:left w:val="single" w:sz="6" w:space="0" w:color="D0D5DD"/>
+              <w:bottom w:val="single" w:sz="6" w:space="0" w:color="D0D5DD"/>
+              <w:right w:val="single" w:sz="6" w:space="0" w:color="D0D5DD"/>
+            </w:tcBorders>
+          </w:tcPr>
+          <w:p>
+            <w:r>
+              <w:rPr>
+                <w:sz w:val="18"/>
+              </w:rPr>
+              <w:t>3.1.50+</w:t>
+            </w:r>
+          </w:p>
+        </w:tc>
+        <w:tc>
+          <w:tcPr>
+            <w:tcW w:type="dxa" w:w="5102"/>
+            <w:shd w:val="clear" w:color="auto" w:fill="FFFFFF"/>
+            <w:tcBorders>
+              <w:top w:val="single" w:sz="6" w:space="0" w:color="D0D5DD"/>
+              <w:left w:val="single" w:sz="6" w:space="0" w:color="D0D5DD"/>
+              <w:bottom w:val="single" w:sz="6" w:space="0" w:color="D0D5DD"/>
+              <w:right w:val="single" w:sz="6" w:space="0" w:color="D0D5DD"/>
+            </w:tcBorders>
+          </w:tcPr>
+          <w:p>
+            <w:r>
+              <w:rPr>
+                <w:sz w:val="18"/>
+              </w:rPr>
+              <w:t>Dependencia auditada para integración Streamlit/Git</w:t>
+            </w:r>
+          </w:p>
+        </w:tc>
+      </w:tr>
+      <w:tr>
+        <w:tc>
+          <w:tcPr>
+            <w:tcW w:type="dxa" w:w="2268"/>
+            <w:shd w:val="clear" w:color="auto" w:fill="F5F7FA"/>
+            <w:tcBorders>
+              <w:top w:val="single" w:sz="6" w:space="0" w:color="D0D5DD"/>
+              <w:left w:val="single" w:sz="6" w:space="0" w:color="D0D5DD"/>
+              <w:bottom w:val="single" w:sz="6" w:space="0" w:color="D0D5DD"/>
+              <w:right w:val="single" w:sz="6" w:space="0" w:color="D0D5DD"/>
+            </w:tcBorders>
+          </w:tcPr>
+          <w:p>
+            <w:r>
+              <w:rPr>
+                <w:sz w:val="18"/>
+              </w:rPr>
+              <w:t>lxml</w:t>
+            </w:r>
+          </w:p>
+        </w:tc>
+        <w:tc>
+          <w:tcPr>
+            <w:tcW w:type="dxa" w:w="1984"/>
+            <w:shd w:val="clear" w:color="auto" w:fill="F5F7FA"/>
+            <w:tcBorders>
+              <w:top w:val="single" w:sz="6" w:space="0" w:color="D0D5DD"/>
+              <w:left w:val="single" w:sz="6" w:space="0" w:color="D0D5DD"/>
+              <w:bottom w:val="single" w:sz="6" w:space="0" w:color="D0D5DD"/>
+              <w:right w:val="single" w:sz="6" w:space="0" w:color="D0D5DD"/>
+            </w:tcBorders>
+          </w:tcPr>
+          <w:p>
+            <w:r>
+              <w:rPr>
+                <w:sz w:val="18"/>
+              </w:rPr>
+              <w:t>6.1+</w:t>
+            </w:r>
+          </w:p>
+        </w:tc>
+        <w:tc>
+          <w:tcPr>
+            <w:tcW w:type="dxa" w:w="5102"/>
+            <w:shd w:val="clear" w:color="auto" w:fill="F5F7FA"/>
+            <w:tcBorders>
+              <w:top w:val="single" w:sz="6" w:space="0" w:color="D0D5DD"/>
+              <w:left w:val="single" w:sz="6" w:space="0" w:color="D0D5DD"/>
+              <w:bottom w:val="single" w:sz="6" w:space="0" w:color="D0D5DD"/>
+              <w:right w:val="single" w:sz="6" w:space="0" w:color="D0D5DD"/>
+            </w:tcBorders>
+          </w:tcPr>
+          <w:p>
+            <w:r>
+              <w:rPr>
+                <w:sz w:val="18"/>
+              </w:rPr>
+              <w:t>Procesamiento XML seguro para documentos</w:t>
+            </w:r>
+          </w:p>
+        </w:tc>
+      </w:tr>
+      <w:tr>
+        <w:tc>
+          <w:tcPr>
+            <w:tcW w:type="dxa" w:w="2268"/>
+            <w:shd w:val="clear" w:color="auto" w:fill="FFFFFF"/>
+            <w:tcBorders>
+              <w:top w:val="single" w:sz="6" w:space="0" w:color="D0D5DD"/>
+              <w:left w:val="single" w:sz="6" w:space="0" w:color="D0D5DD"/>
+              <w:bottom w:val="single" w:sz="6" w:space="0" w:color="D0D5DD"/>
+              <w:right w:val="single" w:sz="6" w:space="0" w:color="D0D5DD"/>
+            </w:tcBorders>
+          </w:tcPr>
+          <w:p>
+            <w:r>
+              <w:rPr>
+                <w:sz w:val="18"/>
+              </w:rPr>
+              <w:t>Pillow</w:t>
+            </w:r>
+          </w:p>
+        </w:tc>
+        <w:tc>
+          <w:tcPr>
+            <w:tcW w:type="dxa" w:w="1984"/>
+            <w:shd w:val="clear" w:color="auto" w:fill="FFFFFF"/>
+            <w:tcBorders>
+              <w:top w:val="single" w:sz="6" w:space="0" w:color="D0D5DD"/>
+              <w:left w:val="single" w:sz="6" w:space="0" w:color="D0D5DD"/>
+              <w:bottom w:val="single" w:sz="6" w:space="0" w:color="D0D5DD"/>
+              <w:right w:val="single" w:sz="6" w:space="0" w:color="D0D5DD"/>
+            </w:tcBorders>
+          </w:tcPr>
+          <w:p>
+            <w:r>
+              <w:rPr>
+                <w:sz w:val="18"/>
+              </w:rPr>
+              <w:t>12.2+</w:t>
+            </w:r>
+          </w:p>
+        </w:tc>
+        <w:tc>
+          <w:tcPr>
+            <w:tcW w:type="dxa" w:w="5102"/>
+            <w:shd w:val="clear" w:color="auto" w:fill="FFFFFF"/>
+            <w:tcBorders>
+              <w:top w:val="single" w:sz="6" w:space="0" w:color="D0D5DD"/>
+              <w:left w:val="single" w:sz="6" w:space="0" w:color="D0D5DD"/>
+              <w:bottom w:val="single" w:sz="6" w:space="0" w:color="D0D5DD"/>
+              <w:right w:val="single" w:sz="6" w:space="0" w:color="D0D5DD"/>
+            </w:tcBorders>
+          </w:tcPr>
+          <w:p>
+            <w:r>
+              <w:rPr>
+                <w:sz w:val="18"/>
+              </w:rPr>
+              <w:t>Procesamiento de imágenes con parches de seguridad</w:t>
+            </w:r>
+          </w:p>
+        </w:tc>
+      </w:tr>
+      <w:tr>
+        <w:tc>
+          <w:tcPr>
+            <w:tcW w:type="dxa" w:w="2268"/>
+            <w:shd w:val="clear" w:color="auto" w:fill="F5F7FA"/>
+            <w:tcBorders>
+              <w:top w:val="single" w:sz="6" w:space="0" w:color="D0D5DD"/>
+              <w:left w:val="single" w:sz="6" w:space="0" w:color="D0D5DD"/>
+              <w:bottom w:val="single" w:sz="6" w:space="0" w:color="D0D5DD"/>
+              <w:right w:val="single" w:sz="6" w:space="0" w:color="D0D5DD"/>
+            </w:tcBorders>
+          </w:tcPr>
+          <w:p>
+            <w:r>
+              <w:rPr>
+                <w:sz w:val="18"/>
+              </w:rPr>
+              <w:t>urllib3</w:t>
+            </w:r>
+          </w:p>
+        </w:tc>
+        <w:tc>
+          <w:tcPr>
+            <w:tcW w:type="dxa" w:w="1984"/>
+            <w:shd w:val="clear" w:color="auto" w:fill="F5F7FA"/>
+            <w:tcBorders>
+              <w:top w:val="single" w:sz="6" w:space="0" w:color="D0D5DD"/>
+              <w:left w:val="single" w:sz="6" w:space="0" w:color="D0D5DD"/>
+              <w:bottom w:val="single" w:sz="6" w:space="0" w:color="D0D5DD"/>
+              <w:right w:val="single" w:sz="6" w:space="0" w:color="D0D5DD"/>
+            </w:tcBorders>
+          </w:tcPr>
+          <w:p>
+            <w:r>
+              <w:rPr>
+                <w:sz w:val="18"/>
+              </w:rPr>
+              <w:t>2.7+</w:t>
+            </w:r>
+          </w:p>
+        </w:tc>
+        <w:tc>
+          <w:tcPr>
+            <w:tcW w:type="dxa" w:w="5102"/>
+            <w:shd w:val="clear" w:color="auto" w:fill="F5F7FA"/>
+            <w:tcBorders>
+              <w:top w:val="single" w:sz="6" w:space="0" w:color="D0D5DD"/>
+              <w:left w:val="single" w:sz="6" w:space="0" w:color="D0D5DD"/>
+              <w:bottom w:val="single" w:sz="6" w:space="0" w:color="D0D5DD"/>
+              <w:right w:val="single" w:sz="6" w:space="0" w:color="D0D5DD"/>
+            </w:tcBorders>
+          </w:tcPr>
+          <w:p>
+            <w:r>
+              <w:rPr>
+                <w:sz w:val="18"/>
+              </w:rPr>
+              <w:t>Cliente HTTP subyacente auditado</w:t>
             </w:r>
           </w:p>
         </w:tc>
@@ -1395,7 +1643,7 @@
           <w:color w:val="0D6EFD"/>
           <w:sz w:val="19"/>
         </w:rPr>
-        <w:t>pip install streamlit pandas plotly networkx numpy openpyxl python-docx requests</w:t>
+        <w:t>pip install -r requirements.txt</w:t>
       </w:r>
     </w:p>
     <w:p>
@@ -1451,6 +1699,25 @@
           <w:sz w:val="19"/>
         </w:rPr>
         <w:t>streamlit run app2.py</w:t>
+      </w:r>
+    </w:p>
+    <w:p>
+      <w:pPr>
+        <w:pStyle w:val="Heading2"/>
+      </w:pPr>
+      <w:r>
+        <w:rPr>
+          <w:color w:val="1E3A5F"/>
+        </w:rPr>
+        <w:t>3.3 Gestión de Sesión y Persistencia Temporal</w:t>
+      </w:r>
+    </w:p>
+    <w:p>
+      <w:r>
+        <w:rPr>
+          <w:sz w:val="21"/>
+        </w:rPr>
+        <w:t>La interfaz mantiene sesión activa durante 30 minutos de actividad. Si el usuario refresca la página dentro de ese período, el navegador restaura la sesión sin solicitar nuevamente credenciales. Los análisis cargados se preservan temporalmente en una caché local del servidor en formato .saml y se eliminan al cerrar sesión, iniciar un nuevo análisis o vencer por inactividad.</w:t>
       </w:r>
     </w:p>
     <w:p>
@@ -2886,6 +3153,44 @@
     </w:p>
     <w:p>
       <w:pPr>
+        <w:pStyle w:val="Heading2"/>
+      </w:pPr>
+      <w:r>
+        <w:rPr>
+          <w:color w:val="1E3A5F"/>
+        </w:rPr>
+        <w:t>Imperator Diagnostics</w:t>
+      </w:r>
+    </w:p>
+    <w:p>
+      <w:r>
+        <w:rPr>
+          <w:sz w:val="21"/>
+        </w:rPr>
+        <w:t>Módulo de validación analítica que revisa dominancia de reglas, explicabilidad del score, falsos positivos estimados, pruebas de estrés de configuración y densidad de riesgo de cartera.</w:t>
+      </w:r>
+    </w:p>
+    <w:p>
+      <w:pPr>
+        <w:pStyle w:val="Heading2"/>
+      </w:pPr>
+      <w:r>
+        <w:rPr>
+          <w:color w:val="1E3A5F"/>
+        </w:rPr>
+        <w:t>Tablas de lectura nítida</w:t>
+      </w:r>
+    </w:p>
+    <w:p>
+      <w:r>
+        <w:rPr>
+          <w:sz w:val="21"/>
+        </w:rPr>
+        <w:t>Las vistas tabulares de la plataforma utilizan un render HTML estático con la paleta institucional para evitar desenfoque visual observado en componentes interactivos del navegador. Este patrón se aplica en Red Transaccional, Resumen Ejecutivo, Casos de Alerta, Transacciones, Matrices e Imperator Diagnostics.</w:t>
+      </w:r>
+    </w:p>
+    <w:p>
+      <w:pPr>
         <w:pStyle w:val="Heading1"/>
       </w:pPr>
       <w:r>
@@ -2971,6 +3276,44 @@
         <w:t>Estructura modular compatible con entornos locales y despliegues en la nube.</w:t>
       </w:r>
     </w:p>
+    <w:p>
+      <w:pPr>
+        <w:pStyle w:val="Heading2"/>
+      </w:pPr>
+      <w:r>
+        <w:rPr>
+          <w:color w:val="1E3A5F"/>
+        </w:rPr>
+        <w:t>Gestión de dependencias</w:t>
+      </w:r>
+    </w:p>
+    <w:p>
+      <w:r>
+        <w:rPr>
+          <w:sz w:val="21"/>
+        </w:rPr>
+        <w:t>Las dependencias críticas se mantienen fijadas en requirements.txt para instalaciones reproducibles. La última auditoría con pip-audit no reportó vulnerabilidades conocidas.</w:t>
+      </w:r>
+    </w:p>
+    <w:p>
+      <w:pPr>
+        <w:pStyle w:val="Heading2"/>
+      </w:pPr>
+      <w:r>
+        <w:rPr>
+          <w:color w:val="1E3A5F"/>
+        </w:rPr>
+        <w:t>Persistencia temporal</w:t>
+      </w:r>
+    </w:p>
+    <w:p>
+      <w:r>
+        <w:rPr>
+          <w:sz w:val="21"/>
+        </w:rPr>
+        <w:t>El análisis cargado se conserva sólo durante la sesión activa y se purga al cerrar sesión o al vencimiento por inactividad.</w:t>
+      </w:r>
+    </w:p>
     <w:p/>
     <w:p>
       <w:pPr>
@@ -2981,7 +3324,7 @@
           <w:color w:val="888888"/>
           <w:sz w:val="18"/>
         </w:rPr>
-        <w:t>SOVEREIGN AML Intelligence Platform v3.0  ·  Generado el 11/05/2026</w:t>
+        <w:t>SOVEREIGN AML Intelligence Platform v3.1  ·  Generado el 13/05/2026</w:t>
       </w:r>
     </w:p>
     <w:sectPr>

</xml_diff>